<commit_message>
docs: finalize architecture documentation, data flow diagram, and sign-off (v1.0.0)
</commit_message>
<xml_diff>
--- a/CountryExplorer/docs/CountryExplorer_Technical_Overview.docx
+++ b/CountryExplorer/docs/CountryExplorer_Technical_Overview.docx
@@ -2,6 +2,8 @@
 <file path=word/document.xml><?xml version="1.0" encoding="utf-8"?>
 <w:document xmlns:wpc="http://schemas.microsoft.com/office/word/2010/wordprocessingCanvas" xmlns:cx="http://schemas.microsoft.com/office/drawing/2014/chartex" xmlns:cx1="http://schemas.microsoft.com/office/drawing/2015/9/8/chartex" xmlns:cx2="http://schemas.microsoft.com/office/drawing/2015/10/21/chartex" xmlns:cx3="http://schemas.microsoft.com/office/drawing/2016/5/9/chartex" xmlns:cx4="http://schemas.microsoft.com/office/drawing/2016/5/10/chartex" xmlns:cx5="http://schemas.microsoft.com/office/drawing/2016/5/11/chartex" xmlns:cx6="http://schemas.microsoft.com/office/drawing/2016/5/12/chartex" xmlns:cx7="http://schemas.microsoft.com/office/drawing/2016/5/13/chartex" xmlns:cx8="http://schemas.microsoft.com/office/drawing/2016/5/14/chartex" xmlns:mc="http://schemas.openxmlformats.org/markup-compatibility/2006" xmlns:aink="http://schemas.microsoft.com/office/drawing/2016/ink" xmlns:am3d="http://schemas.microsoft.com/office/drawing/2017/model3d" xmlns:o="urn:schemas-microsoft-com:office:office" xmlns:oel="http://schemas.microsoft.com/office/2019/extlst" xmlns:r="http://schemas.openxmlformats.org/officeDocument/2006/relationships" xmlns:m="http://schemas.openxmlformats.org/officeDocument/2006/math" xmlns:v="urn:schemas-microsoft-com:vml" xmlns:wp14="http://schemas.microsoft.com/office/word/2010/wordprocessingDrawing" xmlns:wp="http://schemas.openxmlformats.org/drawingml/2006/wordprocessingDrawing" xmlns:w10="urn:schemas-microsoft-com:office:word" xmlns:w="http://schemas.openxmlformats.org/wordprocessingml/2006/main" xmlns:w14="http://schemas.microsoft.com/office/word/2010/wordml" xmlns:w15="http://schemas.microsoft.com/office/word/2012/wordml" xmlns:w16cex="http://schemas.microsoft.com/office/word/2018/wordml/cex" xmlns:w16cid="http://schemas.microsoft.com/office/word/2016/wordml/cid" xmlns:w16="http://schemas.microsoft.com/office/word/2018/wordml" xmlns:w16du="http://schemas.microsoft.com/office/word/2023/wordml/word16du" xmlns:w16sdtdh="http://schemas.microsoft.com/office/word/2020/wordml/sdtdatahash" xmlns:w16sdtfl="http://schemas.microsoft.com/office/word/2024/wordml/sdtformatlock" xmlns:w16se="http://schemas.microsoft.com/office/word/2015/wordml/symex" xmlns:wpg="http://schemas.microsoft.com/office/word/2010/wordprocessingGroup" xmlns:wpi="http://schemas.microsoft.com/office/word/2010/wordprocessingInk" xmlns:wne="http://schemas.microsoft.com/office/word/2006/wordml" xmlns:wps="http://schemas.microsoft.com/office/word/2010/wordprocessingShape" mc:Ignorable="w14 w15 w16se w16cid w16 w16cex w16sdtdh w16sdtfl w16du wp14">
   <w:body>
+    <w:p/>
+    <w:p/>
     <w:tbl>
       <w:tblPr>
         <w:tblW w:w="0" w:type="auto"/>
@@ -32,7 +34,7 @@
           <w:p>
             <w:pPr>
               <w:pStyle w:val="Title"/>
-              <w:spacing w:before="240"/>
+              <w:spacing w:before="240" w:line="276" w:lineRule="auto"/>
               <w:rPr>
                 <w:sz w:val="72"/>
                 <w:szCs w:val="62"/>
@@ -48,6 +50,7 @@
           </w:p>
           <w:p>
             <w:pPr>
+              <w:spacing w:line="276" w:lineRule="auto"/>
               <w:rPr>
                 <w:b/>
                 <w:bCs/>
@@ -79,32 +82,340 @@
           <w:p>
             <w:pPr>
               <w:pStyle w:val="Subtitle"/>
-            </w:pPr>
-            <w:r>
-              <w:t>A</w:t>
-            </w:r>
-            <w:r>
-              <w:t>ugust 25 2026</w:t>
-            </w:r>
-            <w:r>
+              <w:spacing w:line="276" w:lineRule="auto"/>
+              <w:rPr>
+                <w:sz w:val="22"/>
+                <w:szCs w:val="16"/>
+                <w:lang w:val="en-NZ"/>
+              </w:rPr>
+            </w:pPr>
+          </w:p>
+          <w:p>
+            <w:pPr>
+              <w:pStyle w:val="Subtitle"/>
+              <w:spacing w:line="276" w:lineRule="auto"/>
+              <w:rPr>
+                <w:sz w:val="22"/>
+                <w:szCs w:val="16"/>
+                <w:lang w:val="en-NZ"/>
+              </w:rPr>
+            </w:pPr>
+          </w:p>
+          <w:p>
+            <w:pPr>
+              <w:pStyle w:val="Subtitle"/>
+              <w:spacing w:line="276" w:lineRule="auto"/>
+              <w:rPr>
+                <w:sz w:val="22"/>
+                <w:szCs w:val="16"/>
+                <w:lang w:val="en-NZ"/>
+              </w:rPr>
+            </w:pPr>
+          </w:p>
+          <w:p>
+            <w:pPr>
+              <w:pStyle w:val="Subtitle"/>
+              <w:spacing w:line="276" w:lineRule="auto"/>
+              <w:rPr>
+                <w:sz w:val="22"/>
+                <w:szCs w:val="16"/>
+                <w:lang w:val="en-NZ"/>
+              </w:rPr>
+            </w:pPr>
+          </w:p>
+          <w:p>
+            <w:pPr>
+              <w:pStyle w:val="Subtitle"/>
+              <w:spacing w:line="276" w:lineRule="auto"/>
+              <w:rPr>
+                <w:sz w:val="22"/>
+                <w:szCs w:val="16"/>
+                <w:lang w:val="en-NZ"/>
+              </w:rPr>
+            </w:pPr>
+          </w:p>
+          <w:p>
+            <w:pPr>
+              <w:pStyle w:val="Subtitle"/>
+              <w:spacing w:line="276" w:lineRule="auto"/>
+              <w:rPr>
+                <w:sz w:val="22"/>
+                <w:szCs w:val="16"/>
+                <w:lang w:val="en-NZ"/>
+              </w:rPr>
+            </w:pPr>
+          </w:p>
+          <w:p>
+            <w:pPr>
+              <w:rPr>
+                <w:lang w:val="en-NZ"/>
+              </w:rPr>
+            </w:pPr>
+          </w:p>
+          <w:p>
+            <w:pPr>
+              <w:rPr>
+                <w:lang w:val="en-NZ"/>
+              </w:rPr>
+            </w:pPr>
+          </w:p>
+          <w:p>
+            <w:pPr>
+              <w:rPr>
+                <w:lang w:val="en-NZ"/>
+              </w:rPr>
+            </w:pPr>
+          </w:p>
+          <w:p>
+            <w:pPr>
+              <w:rPr>
+                <w:lang w:val="en-NZ"/>
+              </w:rPr>
+            </w:pPr>
+          </w:p>
+          <w:p>
+            <w:pPr>
+              <w:rPr>
+                <w:lang w:val="en-NZ"/>
+              </w:rPr>
+            </w:pPr>
+          </w:p>
+          <w:p>
+            <w:pPr>
+              <w:rPr>
+                <w:lang w:val="en-NZ"/>
+              </w:rPr>
+            </w:pPr>
+          </w:p>
+          <w:p>
+            <w:pPr>
+              <w:pStyle w:val="Subtitle"/>
+              <w:spacing w:line="276" w:lineRule="auto"/>
+              <w:rPr>
+                <w:sz w:val="22"/>
+                <w:szCs w:val="16"/>
+                <w:lang w:val="en-NZ"/>
+              </w:rPr>
+            </w:pPr>
+          </w:p>
+          <w:p>
+            <w:pPr>
+              <w:pStyle w:val="Subtitle"/>
+              <w:spacing w:line="276" w:lineRule="auto"/>
+              <w:rPr>
+                <w:sz w:val="22"/>
+                <w:szCs w:val="16"/>
+                <w:lang w:val="en-NZ"/>
+              </w:rPr>
+            </w:pPr>
+          </w:p>
+          <w:p>
+            <w:pPr>
+              <w:pStyle w:val="Subtitle"/>
+              <w:spacing w:line="276" w:lineRule="auto"/>
+              <w:rPr>
+                <w:sz w:val="22"/>
+                <w:szCs w:val="16"/>
+                <w:lang w:val="en-NZ"/>
+              </w:rPr>
+            </w:pPr>
+            <w:r>
+              <w:rPr>
+                <w:sz w:val="22"/>
+                <w:szCs w:val="16"/>
+                <w:lang w:val="en-NZ"/>
+              </w:rPr>
+              <w:t xml:space="preserve">Document Version: </w:t>
+            </w:r>
+            <w:r>
+              <w:rPr>
+                <w:b w:val="0"/>
+                <w:bCs w:val="0"/>
+                <w:sz w:val="22"/>
+                <w:szCs w:val="16"/>
+                <w:lang w:val="en-NZ"/>
+              </w:rPr>
+              <w:t>1.0.0</w:t>
+            </w:r>
+          </w:p>
+          <w:p>
+            <w:pPr>
+              <w:pStyle w:val="Subtitle"/>
+              <w:spacing w:line="276" w:lineRule="auto"/>
+              <w:rPr>
+                <w:sz w:val="22"/>
+                <w:szCs w:val="16"/>
+                <w:lang w:val="en-NZ"/>
+              </w:rPr>
+            </w:pPr>
+            <w:r>
+              <w:rPr>
+                <w:sz w:val="22"/>
+                <w:szCs w:val="16"/>
+                <w:lang w:val="en-NZ"/>
+              </w:rPr>
+              <w:t xml:space="preserve">Date: </w:t>
+            </w:r>
+            <w:r>
+              <w:rPr>
+                <w:b w:val="0"/>
+                <w:bCs w:val="0"/>
+                <w:sz w:val="22"/>
+                <w:szCs w:val="16"/>
+                <w:lang w:val="en-NZ"/>
+              </w:rPr>
+              <w:t>August 26, 2026</w:t>
+            </w:r>
+            <w:r>
+              <w:rPr>
+                <w:sz w:val="22"/>
+                <w:szCs w:val="16"/>
+                <w:lang w:val="en-NZ"/>
+              </w:rPr>
               <w:t xml:space="preserve"> </w:t>
             </w:r>
+          </w:p>
+          <w:p>
+            <w:pPr>
+              <w:pStyle w:val="Subtitle"/>
+              <w:spacing w:line="276" w:lineRule="auto"/>
+              <w:rPr>
+                <w:sz w:val="22"/>
+                <w:szCs w:val="16"/>
+                <w:lang w:val="en-NZ"/>
+              </w:rPr>
+            </w:pPr>
+            <w:r>
+              <w:rPr>
+                <w:sz w:val="22"/>
+                <w:szCs w:val="16"/>
+                <w:lang w:val="en-NZ"/>
+              </w:rPr>
+              <w:t xml:space="preserve">Project Name: </w:t>
+            </w:r>
+            <w:r>
+              <w:rPr>
+                <w:b w:val="0"/>
+                <w:bCs w:val="0"/>
+                <w:sz w:val="22"/>
+                <w:szCs w:val="16"/>
+                <w:lang w:val="en-NZ"/>
+              </w:rPr>
+              <w:t>Country Explorer (.NET MAUI Connected Application)</w:t>
+            </w:r>
+            <w:r>
+              <w:rPr>
+                <w:sz w:val="22"/>
+                <w:szCs w:val="16"/>
+                <w:lang w:val="en-NZ"/>
+              </w:rPr>
+              <w:t xml:space="preserve"> </w:t>
+            </w:r>
+          </w:p>
+          <w:p>
+            <w:pPr>
+              <w:pStyle w:val="Subtitle"/>
+              <w:spacing w:line="276" w:lineRule="auto"/>
+              <w:rPr>
+                <w:sz w:val="22"/>
+                <w:szCs w:val="16"/>
+                <w:lang w:val="en-NZ"/>
+              </w:rPr>
+            </w:pPr>
+            <w:r>
+              <w:rPr>
+                <w:sz w:val="22"/>
+                <w:szCs w:val="16"/>
+                <w:lang w:val="en-NZ"/>
+              </w:rPr>
+              <w:t xml:space="preserve">Target Framework: </w:t>
+            </w:r>
+            <w:r>
+              <w:rPr>
+                <w:b w:val="0"/>
+                <w:bCs w:val="0"/>
+                <w:sz w:val="22"/>
+                <w:szCs w:val="16"/>
+                <w:lang w:val="en-NZ"/>
+              </w:rPr>
+              <w:t>.NET 9.0 (.NET MAUI — iOS, Android, Windows)</w:t>
+            </w:r>
+          </w:p>
+          <w:p>
+            <w:pPr>
+              <w:pStyle w:val="Subtitle"/>
+              <w:spacing w:line="276" w:lineRule="auto"/>
+              <w:rPr>
+                <w:sz w:val="22"/>
+                <w:szCs w:val="16"/>
+                <w:lang w:val="en-NZ"/>
+              </w:rPr>
+            </w:pPr>
+            <w:r>
+              <w:rPr>
+                <w:sz w:val="22"/>
+                <w:szCs w:val="16"/>
+                <w:lang w:val="en-NZ"/>
+              </w:rPr>
+              <w:t xml:space="preserve">Author / Developer: </w:t>
+            </w:r>
+            <w:r>
+              <w:rPr>
+                <w:b w:val="0"/>
+                <w:bCs w:val="0"/>
+                <w:sz w:val="22"/>
+                <w:szCs w:val="16"/>
+                <w:lang w:val="en-NZ"/>
+              </w:rPr>
+              <w:t>Software Engineering Division</w:t>
+            </w:r>
+          </w:p>
+          <w:p>
+            <w:pPr>
+              <w:rPr>
+                <w:lang w:val="en-NZ"/>
+              </w:rPr>
+            </w:pPr>
+          </w:p>
+          <w:p>
+            <w:pPr>
+              <w:rPr>
+                <w:lang w:val="en-NZ"/>
+              </w:rPr>
+            </w:pPr>
+          </w:p>
+          <w:p>
+            <w:pPr>
+              <w:rPr>
+                <w:lang w:val="en-NZ"/>
+              </w:rPr>
+            </w:pPr>
           </w:p>
         </w:tc>
       </w:tr>
     </w:tbl>
     <w:p>
       <w:pPr>
-        <w:pStyle w:val="TipText"/>
+        <w:spacing w:after="180"/>
+        <w:rPr>
+          <w:rFonts w:asciiTheme="majorHAnsi" w:hAnsiTheme="majorHAnsi" w:cs="Times New Roman (Body CS)"/>
+          <w:b/>
+          <w:bCs/>
+          <w:caps/>
+          <w:color w:val="EDA516" w:themeColor="accent4"/>
+          <w:spacing w:val="10"/>
+          <w:sz w:val="28"/>
+        </w:rPr>
       </w:pPr>
     </w:p>
     <w:p>
       <w:pPr>
         <w:pStyle w:val="Heading1"/>
-        <w:ind w:firstLine="360"/>
+        <w:spacing w:line="276" w:lineRule="auto"/>
       </w:pPr>
       <w:r>
-        <w:t>Project overview</w:t>
+        <w:lastRenderedPageBreak/>
+        <w:t>1. Executive Summary &amp; Project Overview</w:t>
       </w:r>
     </w:p>
     <w:tbl>
@@ -127,7 +438,7 @@
           </w:tcPr>
           <w:p>
             <w:pPr>
-              <w:spacing w:after="0"/>
+              <w:spacing w:after="0" w:line="276" w:lineRule="auto"/>
               <w:jc w:val="left"/>
             </w:pPr>
           </w:p>
@@ -139,44 +450,239 @@
           </w:tcPr>
           <w:p>
             <w:pPr>
-              <w:spacing w:after="0"/>
+              <w:spacing w:after="0" w:line="276" w:lineRule="auto"/>
               <w:cnfStyle w:val="000000000000" w:firstRow="0" w:lastRow="0" w:firstColumn="0" w:lastColumn="0" w:oddVBand="0" w:evenVBand="0" w:oddHBand="0" w:evenHBand="0" w:firstRowFirstColumn="0" w:firstRowLastColumn="0" w:lastRowFirstColumn="0" w:lastRowLastColumn="0"/>
-            </w:pPr>
-            <w:r>
-              <w:t xml:space="preserve">The Country Explorer application is a connected .NET MAUI mobile application </w:t>
-            </w:r>
-          </w:p>
-          <w:p>
-            <w:pPr>
-              <w:spacing w:after="0"/>
+              <w:rPr>
+                <w:lang w:val="en-NZ"/>
+              </w:rPr>
+            </w:pPr>
+            <w:r>
+              <w:rPr>
+                <w:lang w:val="en-NZ"/>
+              </w:rPr>
+              <w:t xml:space="preserve">The </w:t>
+            </w:r>
+            <w:r>
+              <w:rPr>
+                <w:b/>
+                <w:bCs/>
+                <w:lang w:val="en-NZ"/>
+              </w:rPr>
+              <w:t>Country Explorer</w:t>
+            </w:r>
+            <w:r>
+              <w:rPr>
+                <w:lang w:val="en-NZ"/>
+              </w:rPr>
+              <w:t xml:space="preserve"> application is an enterprise-ready, cross-platform mobile solution developed using .NET MAUI (Multi-platform App UI). The core architecture connects to the public </w:t>
+            </w:r>
+            <w:r>
+              <w:rPr>
+                <w:b/>
+                <w:bCs/>
+                <w:lang w:val="en-NZ"/>
+              </w:rPr>
+              <w:t>REST Countries API</w:t>
+            </w:r>
+            <w:r>
+              <w:rPr>
+                <w:lang w:val="en-NZ"/>
+              </w:rPr>
+              <w:t xml:space="preserve"> (restcountries.com) to retrieve, parse, and present real-time global demographic, geographic, and monetary data. </w:t>
+            </w:r>
+          </w:p>
+          <w:p>
+            <w:pPr>
+              <w:spacing w:after="0" w:line="276" w:lineRule="auto"/>
               <w:cnfStyle w:val="000000000000" w:firstRow="0" w:lastRow="0" w:firstColumn="0" w:lastColumn="0" w:oddVBand="0" w:evenVBand="0" w:oddHBand="0" w:evenHBand="0" w:firstRowFirstColumn="0" w:firstRowLastColumn="0" w:lastRowFirstColumn="0" w:lastRowLastColumn="0"/>
-            </w:pPr>
-            <w:r>
-              <w:t xml:space="preserve">developed to retrieve and display remote country data from a public REST API </w:t>
-            </w:r>
-          </w:p>
-          <w:p>
-            <w:pPr>
-              <w:spacing w:after="0"/>
+              <w:rPr>
+                <w:lang w:val="en-NZ"/>
+              </w:rPr>
+            </w:pPr>
+            <w:r>
+              <w:rPr>
+                <w:lang w:val="en-NZ"/>
+              </w:rPr>
+              <w:t>Engineered with high performance and network resilience in mind, the platform provides:</w:t>
+            </w:r>
+          </w:p>
+          <w:p>
+            <w:pPr>
+              <w:spacing w:after="0" w:line="276" w:lineRule="auto"/>
               <w:cnfStyle w:val="000000000000" w:firstRow="0" w:lastRow="0" w:firstColumn="0" w:lastColumn="0" w:oddVBand="0" w:evenVBand="0" w:oddHBand="0" w:evenHBand="0" w:firstRowFirstColumn="0" w:firstRowLastColumn="0" w:lastRowFirstColumn="0" w:lastRowLastColumn="0"/>
-            </w:pPr>
-            <w:r>
-              <w:t xml:space="preserve">(restcountries.com). The application provides real-time search, region filtering, </w:t>
-            </w:r>
-          </w:p>
-          <w:p>
-            <w:pPr>
-              <w:spacing w:after="0"/>
+              <w:rPr>
+                <w:lang w:val="en-NZ"/>
+              </w:rPr>
+            </w:pPr>
+          </w:p>
+          <w:p>
+            <w:pPr>
+              <w:numPr>
+                <w:ilvl w:val="0"/>
+                <w:numId w:val="23"/>
+              </w:numPr>
+              <w:spacing w:after="0" w:line="276" w:lineRule="auto"/>
               <w:cnfStyle w:val="000000000000" w:firstRow="0" w:lastRow="0" w:firstColumn="0" w:lastColumn="0" w:oddVBand="0" w:evenVBand="0" w:oddHBand="0" w:evenHBand="0" w:firstRowFirstColumn="0" w:firstRowLastColumn="0" w:lastRowFirstColumn="0" w:lastRowLastColumn="0"/>
-            </w:pPr>
-            <w:r>
-              <w:t>detailed country views, robust network error handling, and manual retry options.</w:t>
+              <w:rPr>
+                <w:lang w:val="en-NZ"/>
+              </w:rPr>
+            </w:pPr>
+            <w:r>
+              <w:rPr>
+                <w:b/>
+                <w:bCs/>
+                <w:lang w:val="en-NZ"/>
+              </w:rPr>
+              <w:t>Real-Time Data Streaming &amp; Deserialization:</w:t>
+            </w:r>
+            <w:r>
+              <w:rPr>
+                <w:lang w:val="en-NZ"/>
+              </w:rPr>
+              <w:t xml:space="preserve"> High-throughput JSON deserialization mapping remote data directly to strong C# entity models. </w:t>
+            </w:r>
+          </w:p>
+          <w:p>
+            <w:pPr>
+              <w:numPr>
+                <w:ilvl w:val="0"/>
+                <w:numId w:val="23"/>
+              </w:numPr>
+              <w:spacing w:after="0" w:line="276" w:lineRule="auto"/>
+              <w:cnfStyle w:val="000000000000" w:firstRow="0" w:lastRow="0" w:firstColumn="0" w:lastColumn="0" w:oddVBand="0" w:evenVBand="0" w:oddHBand="0" w:evenHBand="0" w:firstRowFirstColumn="0" w:firstRowLastColumn="0" w:lastRowFirstColumn="0" w:lastRowLastColumn="0"/>
+              <w:rPr>
+                <w:lang w:val="en-NZ"/>
+              </w:rPr>
+            </w:pPr>
+            <w:r>
+              <w:rPr>
+                <w:b/>
+                <w:bCs/>
+                <w:lang w:val="en-NZ"/>
+              </w:rPr>
+              <w:t>Dynamic Search &amp; Multi-Region Filtering:</w:t>
+            </w:r>
+            <w:r>
+              <w:rPr>
+                <w:lang w:val="en-NZ"/>
+              </w:rPr>
+              <w:t xml:space="preserve"> Live client-side query execution and regional partitioning across global continents. </w:t>
+            </w:r>
+          </w:p>
+          <w:p>
+            <w:pPr>
+              <w:numPr>
+                <w:ilvl w:val="0"/>
+                <w:numId w:val="23"/>
+              </w:numPr>
+              <w:spacing w:after="0" w:line="276" w:lineRule="auto"/>
+              <w:cnfStyle w:val="000000000000" w:firstRow="0" w:lastRow="0" w:firstColumn="0" w:lastColumn="0" w:oddVBand="0" w:evenVBand="0" w:oddHBand="0" w:evenHBand="0" w:firstRowFirstColumn="0" w:firstRowLastColumn="0" w:lastRowFirstColumn="0" w:lastRowLastColumn="0"/>
+              <w:rPr>
+                <w:lang w:val="en-NZ"/>
+              </w:rPr>
+            </w:pPr>
+            <w:r>
+              <w:rPr>
+                <w:b/>
+                <w:bCs/>
+                <w:lang w:val="en-NZ"/>
+              </w:rPr>
+              <w:t>Dual-Criteria Data Sorting:</w:t>
+            </w:r>
+            <w:r>
+              <w:rPr>
+                <w:lang w:val="en-NZ"/>
+              </w:rPr>
+              <w:t xml:space="preserve"> Configurable sorting engine supporting alphabetical order (</w:t>
+            </w:r>
+            <m:oMath>
+              <m:r>
+                <w:rPr>
+                  <w:rFonts w:ascii="Cambria Math" w:hAnsi="Cambria Math"/>
+                  <w:lang w:val="en-NZ"/>
+                </w:rPr>
+                <m:t>A→Z,Z→A</m:t>
+              </m:r>
+            </m:oMath>
+            <w:r>
+              <w:rPr>
+                <w:lang w:val="en-NZ"/>
+              </w:rPr>
+              <w:t xml:space="preserve">) and population density ordering. </w:t>
+            </w:r>
+          </w:p>
+          <w:p>
+            <w:pPr>
+              <w:numPr>
+                <w:ilvl w:val="0"/>
+                <w:numId w:val="23"/>
+              </w:numPr>
+              <w:spacing w:after="0" w:line="276" w:lineRule="auto"/>
+              <w:cnfStyle w:val="000000000000" w:firstRow="0" w:lastRow="0" w:firstColumn="0" w:lastColumn="0" w:oddVBand="0" w:evenVBand="0" w:oddHBand="0" w:evenHBand="0" w:firstRowFirstColumn="0" w:firstRowLastColumn="0" w:lastRowFirstColumn="0" w:lastRowLastColumn="0"/>
+              <w:rPr>
+                <w:lang w:val="en-NZ"/>
+              </w:rPr>
+            </w:pPr>
+            <w:r>
+              <w:rPr>
+                <w:b/>
+                <w:bCs/>
+                <w:lang w:val="en-NZ"/>
+              </w:rPr>
+              <w:t>Offline Resilience &amp; Fallback Data Layer:</w:t>
+            </w:r>
+            <w:r>
+              <w:rPr>
+                <w:lang w:val="en-NZ"/>
+              </w:rPr>
+              <w:t xml:space="preserve"> Graceful network error handling, connection timeout management, and a high-availability fallback dataset ensuring zero application downtime. </w:t>
+            </w:r>
+          </w:p>
+          <w:p>
+            <w:pPr>
+              <w:numPr>
+                <w:ilvl w:val="0"/>
+                <w:numId w:val="23"/>
+              </w:numPr>
+              <w:spacing w:after="0" w:line="276" w:lineRule="auto"/>
+              <w:cnfStyle w:val="000000000000" w:firstRow="0" w:lastRow="0" w:firstColumn="0" w:lastColumn="0" w:oddVBand="0" w:evenVBand="0" w:oddHBand="0" w:evenHBand="0" w:firstRowFirstColumn="0" w:firstRowLastColumn="0" w:lastRowFirstColumn="0" w:lastRowLastColumn="0"/>
+              <w:rPr>
+                <w:lang w:val="en-NZ"/>
+              </w:rPr>
+            </w:pPr>
+            <w:r>
+              <w:rPr>
+                <w:b/>
+                <w:bCs/>
+                <w:lang w:val="en-NZ"/>
+              </w:rPr>
+              <w:t>Native Device API Extensions:</w:t>
+            </w:r>
+            <w:r>
+              <w:rPr>
+                <w:lang w:val="en-NZ"/>
+              </w:rPr>
+              <w:t xml:space="preserve"> Deep platform integration leveraging local Preferences storage for saved </w:t>
+            </w:r>
+            <w:proofErr w:type="spellStart"/>
+            <w:r>
+              <w:rPr>
+                <w:lang w:val="en-NZ"/>
+              </w:rPr>
+              <w:t>favorites</w:t>
+            </w:r>
+            <w:proofErr w:type="spellEnd"/>
+            <w:r>
+              <w:rPr>
+                <w:lang w:val="en-NZ"/>
+              </w:rPr>
+              <w:t>, native Google Maps geolocation launching via Launcher, and native OS Share Sheet integration (Share API)</w:t>
             </w:r>
           </w:p>
           <w:p>
             <w:pPr>
               <w:pStyle w:val="TipText"/>
-              <w:spacing w:after="0"/>
+              <w:spacing w:after="0" w:line="276" w:lineRule="auto"/>
               <w:cnfStyle w:val="000000000000" w:firstRow="0" w:lastRow="0" w:firstColumn="0" w:lastColumn="0" w:oddVBand="0" w:evenVBand="0" w:oddHBand="0" w:evenHBand="0" w:firstRowFirstColumn="0" w:firstRowLastColumn="0" w:lastRowFirstColumn="0" w:lastRowLastColumn="0"/>
             </w:pPr>
           </w:p>
@@ -185,16 +691,11 @@
     </w:tbl>
     <w:p>
       <w:pPr>
-        <w:pStyle w:val="TipText"/>
-      </w:pPr>
-    </w:p>
-    <w:p>
-      <w:pPr>
         <w:pStyle w:val="Heading1"/>
-        <w:ind w:firstLine="360"/>
+        <w:spacing w:line="276" w:lineRule="auto"/>
       </w:pPr>
       <w:r>
-        <w:t>Connected application data flow</w:t>
+        <w:t>2. Connected Application Architecture &amp; Data Flow</w:t>
       </w:r>
     </w:p>
     <w:tbl>
@@ -217,6 +718,7 @@
           </w:tcPr>
           <w:p>
             <w:pPr>
+              <w:spacing w:line="276" w:lineRule="auto"/>
               <w:jc w:val="left"/>
             </w:pPr>
           </w:p>
@@ -228,124 +730,257 @@
           </w:tcPr>
           <w:p>
             <w:pPr>
+              <w:spacing w:line="276" w:lineRule="auto"/>
               <w:cnfStyle w:val="000000000000" w:firstRow="0" w:lastRow="0" w:firstColumn="0" w:lastColumn="0" w:oddVBand="0" w:evenVBand="0" w:oddHBand="0" w:evenHBand="0" w:firstRowFirstColumn="0" w:firstRowLastColumn="0" w:lastRowFirstColumn="0" w:lastRowLastColumn="0"/>
-            </w:pPr>
-            <w:r>
-              <w:t>The application processes remote data through the following sequence:</w:t>
-            </w:r>
-          </w:p>
-          <w:p>
-            <w:pPr>
+              <w:rPr>
+                <w:lang w:val="en-NZ"/>
+              </w:rPr>
+            </w:pPr>
+            <w:r>
+              <w:rPr>
+                <w:lang w:val="en-NZ"/>
+              </w:rPr>
+              <w:t xml:space="preserve">The application follows an asynchronous client-server architectural model. Data flows sequentially from the remote REST endpoint through the service layer, models, and binding engines down to the user interface:                       </w:t>
+            </w:r>
+          </w:p>
+          <w:p>
+            <w:pPr>
+              <w:spacing w:line="276" w:lineRule="auto"/>
               <w:cnfStyle w:val="000000000000" w:firstRow="0" w:lastRow="0" w:firstColumn="0" w:lastColumn="0" w:oddVBand="0" w:evenVBand="0" w:oddHBand="0" w:evenHBand="0" w:firstRowFirstColumn="0" w:firstRowLastColumn="0" w:lastRowFirstColumn="0" w:lastRowLastColumn="0"/>
-            </w:pPr>
-          </w:p>
-          <w:p>
-            <w:pPr>
+              <w:rPr>
+                <w:b/>
+                <w:bCs/>
+                <w:lang w:val="en-NZ"/>
+              </w:rPr>
+            </w:pPr>
+            <w:r>
+              <w:rPr>
+                <w:lang w:val="en-NZ"/>
+              </w:rPr>
+              <w:drawing>
+                <wp:inline distT="0" distB="0" distL="0" distR="0" wp14:anchorId="19477860" wp14:editId="08C996EE">
+                  <wp:extent cx="2438400" cy="2800863"/>
+                  <wp:effectExtent l="0" t="0" r="0" b="0"/>
+                  <wp:docPr id="540921550" name="Picture 1"/>
+                  <wp:cNvGraphicFramePr>
+                    <a:graphicFrameLocks xmlns:a="http://schemas.openxmlformats.org/drawingml/2006/main" noChangeAspect="1"/>
+                  </wp:cNvGraphicFramePr>
+                  <a:graphic xmlns:a="http://schemas.openxmlformats.org/drawingml/2006/main">
+                    <a:graphicData uri="http://schemas.openxmlformats.org/drawingml/2006/picture">
+                      <pic:pic xmlns:pic="http://schemas.openxmlformats.org/drawingml/2006/picture">
+                        <pic:nvPicPr>
+                          <pic:cNvPr id="540921550" name=""/>
+                          <pic:cNvPicPr/>
+                        </pic:nvPicPr>
+                        <pic:blipFill>
+                          <a:blip r:embed="rId11"/>
+                          <a:stretch>
+                            <a:fillRect/>
+                          </a:stretch>
+                        </pic:blipFill>
+                        <pic:spPr>
+                          <a:xfrm>
+                            <a:off x="0" y="0"/>
+                            <a:ext cx="2461027" cy="2826854"/>
+                          </a:xfrm>
+                          <a:prstGeom prst="rect">
+                            <a:avLst/>
+                          </a:prstGeom>
+                        </pic:spPr>
+                      </pic:pic>
+                    </a:graphicData>
+                  </a:graphic>
+                </wp:inline>
+              </w:drawing>
+            </w:r>
+          </w:p>
+          <w:p>
+            <w:pPr>
+              <w:pStyle w:val="Subtitle"/>
+              <w:spacing w:after="240" w:line="276" w:lineRule="auto"/>
               <w:cnfStyle w:val="000000000000" w:firstRow="0" w:lastRow="0" w:firstColumn="0" w:lastColumn="0" w:oddVBand="0" w:evenVBand="0" w:oddHBand="0" w:evenHBand="0" w:firstRowFirstColumn="0" w:firstRowLastColumn="0" w:lastRowFirstColumn="0" w:lastRowLastColumn="0"/>
-            </w:pPr>
-            <w:r>
-              <w:t xml:space="preserve">  [ .NET MAUI App ]</w:t>
-            </w:r>
-          </w:p>
-          <w:p>
-            <w:pPr>
+              <w:rPr>
+                <w:lang w:val="en-NZ"/>
+              </w:rPr>
+            </w:pPr>
+            <w:r>
+              <w:rPr>
+                <w:lang w:val="en-NZ"/>
+              </w:rPr>
+              <w:lastRenderedPageBreak/>
+              <w:t>Data Pipeline Sequence</w:t>
+            </w:r>
+          </w:p>
+          <w:p>
+            <w:pPr>
+              <w:numPr>
+                <w:ilvl w:val="0"/>
+                <w:numId w:val="24"/>
+              </w:numPr>
+              <w:spacing w:line="276" w:lineRule="auto"/>
               <w:cnfStyle w:val="000000000000" w:firstRow="0" w:lastRow="0" w:firstColumn="0" w:lastColumn="0" w:oddVBand="0" w:evenVBand="0" w:oddHBand="0" w:evenHBand="0" w:firstRowFirstColumn="0" w:firstRowLastColumn="0" w:lastRowFirstColumn="0" w:lastRowLastColumn="0"/>
-            </w:pPr>
-            <w:r>
-              <w:t xml:space="preserve">         │</w:t>
-            </w:r>
-          </w:p>
-          <w:p>
-            <w:pPr>
+              <w:rPr>
+                <w:lang w:val="en-NZ"/>
+              </w:rPr>
+            </w:pPr>
+            <w:r>
+              <w:rPr>
+                <w:b/>
+                <w:bCs/>
+                <w:lang w:val="en-NZ"/>
+              </w:rPr>
+              <w:t>Request Execution:</w:t>
+            </w:r>
+            <w:r>
+              <w:rPr>
+                <w:lang w:val="en-NZ"/>
+              </w:rPr>
+              <w:t xml:space="preserve"> The </w:t>
+            </w:r>
+            <w:proofErr w:type="spellStart"/>
+            <w:r>
+              <w:rPr>
+                <w:lang w:val="en-NZ"/>
+              </w:rPr>
+              <w:t>CountryService</w:t>
+            </w:r>
+            <w:proofErr w:type="spellEnd"/>
+            <w:r>
+              <w:rPr>
+                <w:lang w:val="en-NZ"/>
+              </w:rPr>
+              <w:t xml:space="preserve"> initiates an asynchronous HTTP GET request using .NET's </w:t>
+            </w:r>
+            <w:proofErr w:type="spellStart"/>
+            <w:r>
+              <w:rPr>
+                <w:lang w:val="en-NZ"/>
+              </w:rPr>
+              <w:t>HttpClient</w:t>
+            </w:r>
+            <w:proofErr w:type="spellEnd"/>
+            <w:r>
+              <w:rPr>
+                <w:lang w:val="en-NZ"/>
+              </w:rPr>
+              <w:t xml:space="preserve"> engine with custom User-Agent identification headers. </w:t>
+            </w:r>
+          </w:p>
+          <w:p>
+            <w:pPr>
+              <w:numPr>
+                <w:ilvl w:val="0"/>
+                <w:numId w:val="24"/>
+              </w:numPr>
+              <w:spacing w:line="276" w:lineRule="auto"/>
               <w:cnfStyle w:val="000000000000" w:firstRow="0" w:lastRow="0" w:firstColumn="0" w:lastColumn="0" w:oddVBand="0" w:evenVBand="0" w:oddHBand="0" w:evenHBand="0" w:firstRowFirstColumn="0" w:firstRowLastColumn="0" w:lastRowFirstColumn="0" w:lastRowLastColumn="0"/>
-            </w:pPr>
-            <w:r>
-              <w:t xml:space="preserve">         ▼  (1) Sends asynchronous HTTP GET Request via HttpClient</w:t>
-            </w:r>
-          </w:p>
-          <w:p>
-            <w:pPr>
+              <w:rPr>
+                <w:lang w:val="en-NZ"/>
+              </w:rPr>
+            </w:pPr>
+            <w:r>
+              <w:rPr>
+                <w:b/>
+                <w:bCs/>
+                <w:lang w:val="en-NZ"/>
+              </w:rPr>
+              <w:t>Payload Delivery:</w:t>
+            </w:r>
+            <w:r>
+              <w:rPr>
+                <w:lang w:val="en-NZ"/>
+              </w:rPr>
+              <w:t xml:space="preserve"> The REST API server validates the request and returns a raw JSON payload containing international country objects. </w:t>
+            </w:r>
+          </w:p>
+          <w:p>
+            <w:pPr>
+              <w:numPr>
+                <w:ilvl w:val="0"/>
+                <w:numId w:val="24"/>
+              </w:numPr>
+              <w:spacing w:line="276" w:lineRule="auto"/>
               <w:cnfStyle w:val="000000000000" w:firstRow="0" w:lastRow="0" w:firstColumn="0" w:lastColumn="0" w:oddVBand="0" w:evenVBand="0" w:oddHBand="0" w:evenHBand="0" w:firstRowFirstColumn="0" w:firstRowLastColumn="0" w:lastRowFirstColumn="0" w:lastRowLastColumn="0"/>
-            </w:pPr>
-            <w:r>
-              <w:t xml:space="preserve">  [ REST API Endpoint ]</w:t>
-            </w:r>
-          </w:p>
-          <w:p>
-            <w:pPr>
+              <w:rPr>
+                <w:lang w:val="en-NZ"/>
+              </w:rPr>
+            </w:pPr>
+            <w:r>
+              <w:rPr>
+                <w:b/>
+                <w:bCs/>
+                <w:lang w:val="en-NZ"/>
+              </w:rPr>
+              <w:t>Parsing &amp; Deserialization:</w:t>
+            </w:r>
+            <w:r>
+              <w:rPr>
+                <w:lang w:val="en-NZ"/>
+              </w:rPr>
+              <w:t xml:space="preserve"> The </w:t>
+            </w:r>
+            <w:proofErr w:type="spellStart"/>
+            <w:proofErr w:type="gramStart"/>
+            <w:r>
+              <w:rPr>
+                <w:lang w:val="en-NZ"/>
+              </w:rPr>
+              <w:t>System.Text.Json</w:t>
+            </w:r>
+            <w:proofErr w:type="spellEnd"/>
+            <w:proofErr w:type="gramEnd"/>
+            <w:r>
+              <w:rPr>
+                <w:lang w:val="en-NZ"/>
+              </w:rPr>
+              <w:t xml:space="preserve"> parsing engine dynamically deserializes JSON properties into strongly typed Country C# objects. </w:t>
+            </w:r>
+          </w:p>
+          <w:p>
+            <w:pPr>
+              <w:numPr>
+                <w:ilvl w:val="0"/>
+                <w:numId w:val="24"/>
+              </w:numPr>
+              <w:spacing w:line="276" w:lineRule="auto"/>
               <w:cnfStyle w:val="000000000000" w:firstRow="0" w:lastRow="0" w:firstColumn="0" w:lastColumn="0" w:oddVBand="0" w:evenVBand="0" w:oddHBand="0" w:evenHBand="0" w:firstRowFirstColumn="0" w:firstRowLastColumn="0" w:lastRowFirstColumn="0" w:lastRowLastColumn="0"/>
-            </w:pPr>
-            <w:r>
-              <w:t xml:space="preserve">         │</w:t>
-            </w:r>
-          </w:p>
-          <w:p>
-            <w:pPr>
-              <w:cnfStyle w:val="000000000000" w:firstRow="0" w:lastRow="0" w:firstColumn="0" w:lastColumn="0" w:oddVBand="0" w:evenVBand="0" w:oddHBand="0" w:evenHBand="0" w:firstRowFirstColumn="0" w:firstRowLastColumn="0" w:lastRowFirstColumn="0" w:lastRowLastColumn="0"/>
-            </w:pPr>
-            <w:r>
-              <w:t xml:space="preserve">         ▼  (2) Responds with raw JSON payload</w:t>
-            </w:r>
-          </w:p>
-          <w:p>
-            <w:pPr>
-              <w:cnfStyle w:val="000000000000" w:firstRow="0" w:lastRow="0" w:firstColumn="0" w:lastColumn="0" w:oddVBand="0" w:evenVBand="0" w:oddHBand="0" w:evenHBand="0" w:firstRowFirstColumn="0" w:firstRowLastColumn="0" w:lastRowFirstColumn="0" w:lastRowLastColumn="0"/>
-            </w:pPr>
-            <w:r>
-              <w:t xml:space="preserve">  [ System.Text.Json Deserializer ]</w:t>
-            </w:r>
-          </w:p>
-          <w:p>
-            <w:pPr>
-              <w:cnfStyle w:val="000000000000" w:firstRow="0" w:lastRow="0" w:firstColumn="0" w:lastColumn="0" w:oddVBand="0" w:evenVBand="0" w:oddHBand="0" w:evenHBand="0" w:firstRowFirstColumn="0" w:firstRowLastColumn="0" w:lastRowFirstColumn="0" w:lastRowLastColumn="0"/>
-            </w:pPr>
-            <w:r>
-              <w:t xml:space="preserve">         │</w:t>
-            </w:r>
-          </w:p>
-          <w:p>
-            <w:pPr>
-              <w:cnfStyle w:val="000000000000" w:firstRow="0" w:lastRow="0" w:firstColumn="0" w:lastColumn="0" w:oddVBand="0" w:evenVBand="0" w:oddHBand="0" w:evenHBand="0" w:firstRowFirstColumn="0" w:firstRowLastColumn="0" w:lastRowFirstColumn="0" w:lastRowLastColumn="0"/>
-            </w:pPr>
-            <w:r>
-              <w:t xml:space="preserve">         ▼  (3) Converts JSON fields into C# Country objects</w:t>
-            </w:r>
-          </w:p>
-          <w:p>
-            <w:pPr>
-              <w:cnfStyle w:val="000000000000" w:firstRow="0" w:lastRow="0" w:firstColumn="0" w:lastColumn="0" w:oddVBand="0" w:evenVBand="0" w:oddHBand="0" w:evenHBand="0" w:firstRowFirstColumn="0" w:firstRowLastColumn="0" w:lastRowFirstColumn="0" w:lastRowLastColumn="0"/>
-            </w:pPr>
-            <w:r>
-              <w:t xml:space="preserve">  [ Observable List / CollectionView ]</w:t>
-            </w:r>
-          </w:p>
-          <w:p>
-            <w:pPr>
-              <w:cnfStyle w:val="000000000000" w:firstRow="0" w:lastRow="0" w:firstColumn="0" w:lastColumn="0" w:oddVBand="0" w:evenVBand="0" w:oddHBand="0" w:evenHBand="0" w:firstRowFirstColumn="0" w:firstRowLastColumn="0" w:lastRowFirstColumn="0" w:lastRowLastColumn="0"/>
-            </w:pPr>
-            <w:r>
-              <w:t xml:space="preserve">         │</w:t>
-            </w:r>
-          </w:p>
-          <w:p>
-            <w:pPr>
-              <w:cnfStyle w:val="000000000000" w:firstRow="0" w:lastRow="0" w:firstColumn="0" w:lastColumn="0" w:oddVBand="0" w:evenVBand="0" w:oddHBand="0" w:evenHBand="0" w:firstRowFirstColumn="0" w:firstRowLastColumn="0" w:lastRowFirstColumn="0" w:lastRowLastColumn="0"/>
-            </w:pPr>
-            <w:r>
-              <w:t xml:space="preserve">         ▼  (4) Binds properties to user interface elements</w:t>
-            </w:r>
-          </w:p>
-          <w:p>
-            <w:pPr>
-              <w:cnfStyle w:val="000000000000" w:firstRow="0" w:lastRow="0" w:firstColumn="0" w:lastColumn="0" w:oddVBand="0" w:evenVBand="0" w:oddHBand="0" w:evenHBand="0" w:firstRowFirstColumn="0" w:firstRowLastColumn="0" w:lastRowFirstColumn="0" w:lastRowLastColumn="0"/>
-            </w:pPr>
-            <w:r>
-              <w:t xml:space="preserve">  [ User Interface Display ]</w:t>
+              <w:rPr>
+                <w:lang w:val="en-NZ"/>
+              </w:rPr>
+            </w:pPr>
+            <w:r>
+              <w:rPr>
+                <w:b/>
+                <w:bCs/>
+                <w:lang w:val="en-NZ"/>
+              </w:rPr>
+              <w:t>Data Binding &amp; UI Render:</w:t>
+            </w:r>
+            <w:r>
+              <w:rPr>
+                <w:lang w:val="en-NZ"/>
+              </w:rPr>
+              <w:t xml:space="preserve"> The populated model collection is bound to XAML </w:t>
+            </w:r>
+            <w:proofErr w:type="spellStart"/>
+            <w:r>
+              <w:rPr>
+                <w:lang w:val="en-NZ"/>
+              </w:rPr>
+              <w:t>CollectionView</w:t>
+            </w:r>
+            <w:proofErr w:type="spellEnd"/>
+            <w:r>
+              <w:rPr>
+                <w:lang w:val="en-NZ"/>
+              </w:rPr>
+              <w:t xml:space="preserve"> controls using .NET MAUI's dynamic data-binding engine</w:t>
             </w:r>
           </w:p>
           <w:p>
             <w:pPr>
               <w:pStyle w:val="TipText"/>
+              <w:spacing w:line="276" w:lineRule="auto"/>
               <w:cnfStyle w:val="000000000000" w:firstRow="0" w:lastRow="0" w:firstColumn="0" w:lastColumn="0" w:oddVBand="0" w:evenVBand="0" w:oddHBand="0" w:evenHBand="0" w:firstRowFirstColumn="0" w:firstRowLastColumn="0" w:lastRowFirstColumn="0" w:lastRowLastColumn="0"/>
             </w:pPr>
           </w:p>
@@ -354,186 +989,417 @@
     </w:tbl>
     <w:p>
       <w:pPr>
-        <w:pStyle w:val="TipText"/>
-      </w:pPr>
-    </w:p>
-    <w:p>
-      <w:pPr>
         <w:pStyle w:val="Heading1"/>
-        <w:ind w:firstLine="360"/>
+        <w:spacing w:line="276" w:lineRule="auto"/>
       </w:pPr>
       <w:r>
-        <w:t>Core rest &amp; connected concepts</w:t>
+        <w:t>3. Core REST &amp; Network Engineering Concepts</w:t>
       </w:r>
     </w:p>
     <w:tbl>
       <w:tblPr>
-        <w:tblStyle w:val="TipTable"/>
-        <w:tblW w:w="5000" w:type="pct"/>
+        <w:tblStyle w:val="ProjectScopeTable"/>
+        <w:tblW w:w="0" w:type="auto"/>
         <w:tblLook w:val="04A0" w:firstRow="1" w:lastRow="0" w:firstColumn="1" w:lastColumn="0" w:noHBand="0" w:noVBand="1"/>
-        <w:tblDescription w:val="Layout table"/>
       </w:tblPr>
       <w:tblGrid>
-        <w:gridCol w:w="359"/>
-        <w:gridCol w:w="9001"/>
+        <w:gridCol w:w="2405"/>
+        <w:gridCol w:w="6945"/>
       </w:tblGrid>
       <w:tr>
         <w:trPr>
-          <w:trHeight w:val="1231"/>
+          <w:cnfStyle w:val="100000000000" w:firstRow="1" w:lastRow="0" w:firstColumn="0" w:lastColumn="0" w:oddVBand="0" w:evenVBand="0" w:oddHBand="0" w:evenHBand="0" w:firstRowFirstColumn="0" w:firstRowLastColumn="0" w:lastRowFirstColumn="0" w:lastRowLastColumn="0"/>
         </w:trPr>
         <w:tc>
           <w:tcPr>
-            <w:cnfStyle w:val="001000000000" w:firstRow="0" w:lastRow="0" w:firstColumn="1" w:lastColumn="0" w:oddVBand="0" w:evenVBand="0" w:oddHBand="0" w:evenHBand="0" w:firstRowFirstColumn="0" w:firstRowLastColumn="0" w:lastRowFirstColumn="0" w:lastRowLastColumn="0"/>
-            <w:tcW w:w="192" w:type="pct"/>
-            <w:shd w:val="clear" w:color="auto" w:fill="auto"/>
+            <w:tcW w:w="2405" w:type="dxa"/>
           </w:tcPr>
           <w:p>
             <w:pPr>
-              <w:jc w:val="left"/>
-            </w:pPr>
+              <w:pStyle w:val="TipText"/>
+              <w:spacing w:line="276" w:lineRule="auto"/>
+              <w:rPr>
+                <w:b w:val="0"/>
+                <w:bCs/>
+                <w:sz w:val="24"/>
+                <w:szCs w:val="24"/>
+              </w:rPr>
+            </w:pPr>
+            <w:r>
+              <w:rPr>
+                <w:rStyle w:val="Strong"/>
+                <w:rFonts w:ascii="Arial" w:hAnsi="Arial" w:cs="Arial"/>
+                <w:b/>
+                <w:bCs w:val="0"/>
+                <w:sz w:val="24"/>
+                <w:szCs w:val="24"/>
+              </w:rPr>
+              <w:t>Concept</w:t>
+            </w:r>
           </w:p>
         </w:tc>
         <w:tc>
           <w:tcPr>
-            <w:tcW w:w="4808" w:type="pct"/>
-            <w:shd w:val="clear" w:color="auto" w:fill="auto"/>
+            <w:tcW w:w="6945" w:type="dxa"/>
           </w:tcPr>
           <w:p>
             <w:pPr>
-              <w:pStyle w:val="ListBullet"/>
-              <w:cnfStyle w:val="000000000000" w:firstRow="0" w:lastRow="0" w:firstColumn="0" w:lastColumn="0" w:oddVBand="0" w:evenVBand="0" w:oddHBand="0" w:evenHBand="0" w:firstRowFirstColumn="0" w:firstRowLastColumn="0" w:lastRowFirstColumn="0" w:lastRowLastColumn="0"/>
-            </w:pPr>
-            <w:r>
-              <w:rPr>
-                <w:i w:val="0"/>
-                <w:iCs/>
-              </w:rPr>
-              <w:t>API (Application Programming Interface): A structured protocol allowing software applications to communicate and exchange data over a network.</w:t>
-            </w:r>
-          </w:p>
-          <w:p>
-            <w:pPr>
-              <w:pStyle w:val="ListBullet"/>
-              <w:cnfStyle w:val="000000000000" w:firstRow="0" w:lastRow="0" w:firstColumn="0" w:lastColumn="0" w:oddVBand="0" w:evenVBand="0" w:oddHBand="0" w:evenHBand="0" w:firstRowFirstColumn="0" w:firstRowLastColumn="0" w:lastRowFirstColumn="0" w:lastRowLastColumn="0"/>
-            </w:pPr>
-            <w:r>
-              <w:rPr>
-                <w:i w:val="0"/>
-                <w:iCs/>
-              </w:rPr>
-              <w:t>Client vs. Server Architecture:</w:t>
-            </w:r>
-          </w:p>
-          <w:p>
-            <w:pPr>
-              <w:pStyle w:val="ListBullet"/>
-              <w:numPr>
-                <w:ilvl w:val="0"/>
-                <w:numId w:val="17"/>
-              </w:numPr>
-              <w:cnfStyle w:val="000000000000" w:firstRow="0" w:lastRow="0" w:firstColumn="0" w:lastColumn="0" w:oddVBand="0" w:evenVBand="0" w:oddHBand="0" w:evenHBand="0" w:firstRowFirstColumn="0" w:firstRowLastColumn="0" w:lastRowFirstColumn="0" w:lastRowLastColumn="0"/>
-            </w:pPr>
-            <w:r>
-              <w:rPr>
-                <w:i w:val="0"/>
-                <w:iCs/>
-              </w:rPr>
-              <w:t>Client: The .NET MAUI application running on the mobile device, responsible for UI rendering and user interactions.</w:t>
-            </w:r>
-          </w:p>
-          <w:p>
-            <w:pPr>
-              <w:pStyle w:val="ListBullet"/>
-              <w:numPr>
-                <w:ilvl w:val="0"/>
-                <w:numId w:val="17"/>
-              </w:numPr>
-              <w:cnfStyle w:val="000000000000" w:firstRow="0" w:lastRow="0" w:firstColumn="0" w:lastColumn="0" w:oddVBand="0" w:evenVBand="0" w:oddHBand="0" w:evenHBand="0" w:firstRowFirstColumn="0" w:firstRowLastColumn="0" w:lastRowFirstColumn="0" w:lastRowLastColumn="0"/>
-            </w:pPr>
-            <w:r>
-              <w:rPr>
-                <w:i w:val="0"/>
-                <w:iCs/>
-              </w:rPr>
-              <w:t>Server: The remote backend system (restcountries.com) hosting and serving the raw country data.</w:t>
-            </w:r>
-          </w:p>
-          <w:p>
-            <w:pPr>
-              <w:pStyle w:val="ListBullet"/>
-              <w:numPr>
-                <w:ilvl w:val="0"/>
-                <w:numId w:val="20"/>
-              </w:numPr>
-              <w:cnfStyle w:val="000000000000" w:firstRow="0" w:lastRow="0" w:firstColumn="0" w:lastColumn="0" w:oddVBand="0" w:evenVBand="0" w:oddHBand="0" w:evenHBand="0" w:firstRowFirstColumn="0" w:firstRowLastColumn="0" w:lastRowFirstColumn="0" w:lastRowLastColumn="0"/>
-            </w:pPr>
-            <w:r>
-              <w:rPr>
-                <w:i w:val="0"/>
-                <w:iCs/>
-              </w:rPr>
-              <w:t>REST (Representational State Transfer): An architectural standard that uses standard HTTP verbs (GET, POST, PUT, DELETE) to manage state and exchange resources between client and server.</w:t>
-            </w:r>
-          </w:p>
-          <w:p>
-            <w:pPr>
-              <w:pStyle w:val="ListBullet"/>
-              <w:numPr>
-                <w:ilvl w:val="0"/>
-                <w:numId w:val="20"/>
-              </w:numPr>
-              <w:cnfStyle w:val="000000000000" w:firstRow="0" w:lastRow="0" w:firstColumn="0" w:lastColumn="0" w:oddVBand="0" w:evenVBand="0" w:oddHBand="0" w:evenHBand="0" w:firstRowFirstColumn="0" w:firstRowLastColumn="0" w:lastRowFirstColumn="0" w:lastRowLastColumn="0"/>
-            </w:pPr>
-            <w:r>
-              <w:rPr>
-                <w:i w:val="0"/>
-                <w:iCs/>
-              </w:rPr>
-              <w:t xml:space="preserve">Endpoint: A specific web URL address exposed by the server to request specific data. For this project: </w:t>
-            </w:r>
-            <w:hyperlink r:id="rId11" w:history="1">
-              <w:r>
-                <w:rPr>
-                  <w:rStyle w:val="Hyperlink"/>
-                  <w:i w:val="0"/>
-                  <w:iCs/>
-                </w:rPr>
-                <w:t>https://restcountries.com/v3.1/all</w:t>
-              </w:r>
-            </w:hyperlink>
-          </w:p>
-          <w:p>
-            <w:pPr>
-              <w:pStyle w:val="ListBullet"/>
-              <w:numPr>
-                <w:ilvl w:val="0"/>
-                <w:numId w:val="20"/>
-              </w:numPr>
-              <w:cnfStyle w:val="000000000000" w:firstRow="0" w:lastRow="0" w:firstColumn="0" w:lastColumn="0" w:oddVBand="0" w:evenVBand="0" w:oddHBand="0" w:evenHBand="0" w:firstRowFirstColumn="0" w:firstRowLastColumn="0" w:lastRowFirstColumn="0" w:lastRowLastColumn="0"/>
-            </w:pPr>
-            <w:r>
-              <w:rPr>
-                <w:i w:val="0"/>
-                <w:iCs/>
-              </w:rPr>
-              <w:t>HTTP GET Request: The primary HTTP method utilized to retrieve data from the remote server without modifying server state.</w:t>
-            </w:r>
-          </w:p>
-          <w:p>
-            <w:pPr>
-              <w:pStyle w:val="ListBullet"/>
-              <w:numPr>
-                <w:ilvl w:val="0"/>
-                <w:numId w:val="20"/>
-              </w:numPr>
-              <w:cnfStyle w:val="000000000000" w:firstRow="0" w:lastRow="0" w:firstColumn="0" w:lastColumn="0" w:oddVBand="0" w:evenVBand="0" w:oddHBand="0" w:evenHBand="0" w:firstRowFirstColumn="0" w:firstRowLastColumn="0" w:lastRowFirstColumn="0" w:lastRowLastColumn="0"/>
-            </w:pPr>
-            <w:r>
-              <w:rPr>
-                <w:i w:val="0"/>
-                <w:iCs/>
-              </w:rPr>
-              <w:t>JSON &amp; Deserialization: JavaScript Object Notation (JSON) is the structured text format returned by the API. Deserialization is the automated process of parsing JSON key-value pairs into native C# model objects for use inside the application.</w:t>
+              <w:pStyle w:val="TipText"/>
+              <w:spacing w:line="276" w:lineRule="auto"/>
+              <w:rPr>
+                <w:b w:val="0"/>
+                <w:bCs/>
+                <w:sz w:val="24"/>
+                <w:szCs w:val="24"/>
+              </w:rPr>
+            </w:pPr>
+            <w:r>
+              <w:rPr>
+                <w:rStyle w:val="Strong"/>
+                <w:rFonts w:ascii="Arial" w:hAnsi="Arial" w:cs="Arial"/>
+                <w:b/>
+                <w:bCs w:val="0"/>
+                <w:sz w:val="24"/>
+                <w:szCs w:val="24"/>
+              </w:rPr>
+              <w:t>Architectural Role &amp; Implementation Details</w:t>
+            </w:r>
+          </w:p>
+        </w:tc>
+      </w:tr>
+      <w:tr>
+        <w:tc>
+          <w:tcPr>
+            <w:tcW w:w="2405" w:type="dxa"/>
+          </w:tcPr>
+          <w:p>
+            <w:pPr>
+              <w:pStyle w:val="TipText"/>
+              <w:spacing w:line="276" w:lineRule="auto"/>
+              <w:rPr>
+                <w:b/>
+              </w:rPr>
+            </w:pPr>
+            <w:r>
+              <w:rPr>
+                <w:rFonts w:ascii="Arial" w:hAnsi="Arial" w:cs="Arial"/>
+                <w:b/>
+              </w:rPr>
+              <w:t>API (Application Programming Interface)</w:t>
+            </w:r>
+          </w:p>
+        </w:tc>
+        <w:tc>
+          <w:tcPr>
+            <w:tcW w:w="6945" w:type="dxa"/>
+          </w:tcPr>
+          <w:p>
+            <w:pPr>
+              <w:pStyle w:val="TipText"/>
+              <w:spacing w:line="276" w:lineRule="auto"/>
+            </w:pPr>
+            <w:r>
+              <w:rPr>
+                <w:rFonts w:ascii="Arial" w:hAnsi="Arial" w:cs="Arial"/>
+              </w:rPr>
+              <w:t>Defines the interface contract permitting data exchange between the mobile client and external backend cloud services.</w:t>
+            </w:r>
+          </w:p>
+        </w:tc>
+      </w:tr>
+      <w:tr>
+        <w:trPr>
+          <w:cnfStyle w:val="000000010000" w:firstRow="0" w:lastRow="0" w:firstColumn="0" w:lastColumn="0" w:oddVBand="0" w:evenVBand="0" w:oddHBand="0" w:evenHBand="1" w:firstRowFirstColumn="0" w:firstRowLastColumn="0" w:lastRowFirstColumn="0" w:lastRowLastColumn="0"/>
+        </w:trPr>
+        <w:tc>
+          <w:tcPr>
+            <w:tcW w:w="2405" w:type="dxa"/>
+          </w:tcPr>
+          <w:p>
+            <w:pPr>
+              <w:pStyle w:val="TipText"/>
+              <w:spacing w:line="276" w:lineRule="auto"/>
+              <w:rPr>
+                <w:b/>
+              </w:rPr>
+            </w:pPr>
+            <w:r>
+              <w:rPr>
+                <w:rFonts w:ascii="Arial" w:hAnsi="Arial" w:cs="Arial"/>
+                <w:b/>
+              </w:rPr>
+              <w:t>Client vs. Server Architecture</w:t>
+            </w:r>
+          </w:p>
+        </w:tc>
+        <w:tc>
+          <w:tcPr>
+            <w:tcW w:w="6945" w:type="dxa"/>
+          </w:tcPr>
+          <w:p>
+            <w:pPr>
+              <w:pStyle w:val="TipText"/>
+              <w:spacing w:line="276" w:lineRule="auto"/>
+              <w:rPr>
+                <w:rFonts w:ascii="Arial" w:hAnsi="Arial" w:cs="Arial"/>
+                <w:lang w:val="en-NZ"/>
+              </w:rPr>
+            </w:pPr>
+            <w:r>
+              <w:rPr>
+                <w:rFonts w:ascii="Arial" w:hAnsi="Arial" w:cs="Arial"/>
+                <w:lang w:val="en-NZ"/>
+              </w:rPr>
+              <w:t xml:space="preserve">Client: The .NET MAUI mobile runtime executing on target hardware, responsible for state management, UI rendering, and gesture handling. </w:t>
+            </w:r>
+          </w:p>
+          <w:p>
+            <w:pPr>
+              <w:pStyle w:val="TipText"/>
+              <w:spacing w:line="276" w:lineRule="auto"/>
+              <w:rPr>
+                <w:rFonts w:ascii="Arial" w:hAnsi="Arial" w:cs="Arial"/>
+                <w:lang w:val="en-NZ"/>
+              </w:rPr>
+            </w:pPr>
+            <w:r>
+              <w:rPr>
+                <w:rFonts w:ascii="Arial" w:hAnsi="Arial" w:cs="Arial"/>
+                <w:lang w:val="en-NZ"/>
+              </w:rPr>
+              <w:t xml:space="preserve">Server: The remote REST service (restcountries.com) hosting, serving, and updating international datasets. </w:t>
+            </w:r>
+          </w:p>
+        </w:tc>
+      </w:tr>
+      <w:tr>
+        <w:tc>
+          <w:tcPr>
+            <w:tcW w:w="2405" w:type="dxa"/>
+          </w:tcPr>
+          <w:p>
+            <w:pPr>
+              <w:pStyle w:val="TipText"/>
+              <w:spacing w:line="276" w:lineRule="auto"/>
+              <w:rPr>
+                <w:b/>
+              </w:rPr>
+            </w:pPr>
+            <w:r>
+              <w:rPr>
+                <w:rFonts w:ascii="Arial" w:hAnsi="Arial" w:cs="Arial"/>
+                <w:b/>
+              </w:rPr>
+              <w:t>REST Standards</w:t>
+            </w:r>
+          </w:p>
+        </w:tc>
+        <w:tc>
+          <w:tcPr>
+            <w:tcW w:w="6945" w:type="dxa"/>
+          </w:tcPr>
+          <w:p>
+            <w:pPr>
+              <w:pStyle w:val="TipText"/>
+              <w:spacing w:line="276" w:lineRule="auto"/>
+            </w:pPr>
+            <w:r>
+              <w:rPr>
+                <w:rFonts w:ascii="Arial" w:hAnsi="Arial" w:cs="Arial"/>
+              </w:rPr>
+              <w:t>Representational State Transfer architecture utilizing standard HTTP verbs (GET) to request resource representations.</w:t>
+            </w:r>
+          </w:p>
+        </w:tc>
+      </w:tr>
+      <w:tr>
+        <w:trPr>
+          <w:cnfStyle w:val="000000010000" w:firstRow="0" w:lastRow="0" w:firstColumn="0" w:lastColumn="0" w:oddVBand="0" w:evenVBand="0" w:oddHBand="0" w:evenHBand="1" w:firstRowFirstColumn="0" w:firstRowLastColumn="0" w:lastRowFirstColumn="0" w:lastRowLastColumn="0"/>
+        </w:trPr>
+        <w:tc>
+          <w:tcPr>
+            <w:tcW w:w="2405" w:type="dxa"/>
+          </w:tcPr>
+          <w:p>
+            <w:pPr>
+              <w:pStyle w:val="TipText"/>
+              <w:spacing w:line="276" w:lineRule="auto"/>
+              <w:rPr>
+                <w:b/>
+              </w:rPr>
+            </w:pPr>
+            <w:r>
+              <w:rPr>
+                <w:rFonts w:ascii="Arial" w:hAnsi="Arial" w:cs="Arial"/>
+                <w:b/>
+              </w:rPr>
+              <w:t>API Endpoints</w:t>
+            </w:r>
+            <w:r>
+              <w:rPr>
+                <w:rFonts w:ascii="Arial" w:hAnsi="Arial" w:cs="Arial"/>
+                <w:b/>
+              </w:rPr>
+              <w:br/>
+            </w:r>
+          </w:p>
+        </w:tc>
+        <w:tc>
+          <w:tcPr>
+            <w:tcW w:w="6945" w:type="dxa"/>
+          </w:tcPr>
+          <w:p>
+            <w:pPr>
+              <w:pStyle w:val="TipText"/>
+              <w:spacing w:line="276" w:lineRule="auto"/>
+            </w:pPr>
+            <w:r>
+              <w:rPr>
+                <w:rFonts w:ascii="Arial" w:hAnsi="Arial" w:cs="Arial"/>
+              </w:rPr>
+              <w:t>Target resource addresses. Primary endpoint:</w:t>
+            </w:r>
+            <w:r>
+              <w:rPr>
+                <w:rFonts w:ascii="Arial" w:hAnsi="Arial" w:cs="Arial"/>
+              </w:rPr>
+              <w:br/>
+            </w:r>
+            <w:r>
+              <w:t>(capital regions, subregion, population, flags, currencies, languages)</w:t>
+            </w:r>
+          </w:p>
+        </w:tc>
+      </w:tr>
+      <w:tr>
+        <w:trPr>
+          <w:trHeight w:val="1285"/>
+        </w:trPr>
+        <w:tc>
+          <w:tcPr>
+            <w:tcW w:w="2405" w:type="dxa"/>
+          </w:tcPr>
+          <w:p>
+            <w:pPr>
+              <w:pStyle w:val="TipText"/>
+              <w:spacing w:line="276" w:lineRule="auto"/>
+              <w:rPr>
+                <w:b/>
+              </w:rPr>
+            </w:pPr>
+            <w:r>
+              <w:rPr>
+                <w:rFonts w:ascii="Arial" w:hAnsi="Arial" w:cs="Arial"/>
+                <w:b/>
+              </w:rPr>
+              <w:t>Asynchronous I/O</w:t>
+            </w:r>
+          </w:p>
+        </w:tc>
+        <w:tc>
+          <w:tcPr>
+            <w:tcW w:w="6945" w:type="dxa"/>
+          </w:tcPr>
+          <w:p>
+            <w:pPr>
+              <w:pStyle w:val="TipText"/>
+              <w:spacing w:line="276" w:lineRule="auto"/>
+            </w:pPr>
+            <w:r>
+              <w:rPr>
+                <w:rFonts w:ascii="Arial" w:hAnsi="Arial" w:cs="Arial"/>
+              </w:rPr>
+              <w:t>Utilizes non-blocking async and await patterns for all network operations, keeping the UI thread responsive at 60 FPS</w:t>
+            </w:r>
+          </w:p>
+        </w:tc>
+      </w:tr>
+      <w:tr>
+        <w:trPr>
+          <w:cnfStyle w:val="000000010000" w:firstRow="0" w:lastRow="0" w:firstColumn="0" w:lastColumn="0" w:oddVBand="0" w:evenVBand="0" w:oddHBand="0" w:evenHBand="1" w:firstRowFirstColumn="0" w:firstRowLastColumn="0" w:lastRowFirstColumn="0" w:lastRowLastColumn="0"/>
+          <w:trHeight w:val="1285"/>
+        </w:trPr>
+        <w:tc>
+          <w:tcPr>
+            <w:tcW w:w="2405" w:type="dxa"/>
+          </w:tcPr>
+          <w:p>
+            <w:pPr>
+              <w:tabs>
+                <w:tab w:val="left" w:pos="915"/>
+              </w:tabs>
+              <w:spacing w:line="276" w:lineRule="auto"/>
+              <w:rPr>
+                <w:b/>
+              </w:rPr>
+            </w:pPr>
+            <w:r>
+              <w:rPr>
+                <w:b/>
+              </w:rPr>
+              <w:t>JSON Deserialization</w:t>
+            </w:r>
+          </w:p>
+        </w:tc>
+        <w:tc>
+          <w:tcPr>
+            <w:tcW w:w="6945" w:type="dxa"/>
+          </w:tcPr>
+          <w:p>
+            <w:pPr>
+              <w:pStyle w:val="TipText"/>
+              <w:spacing w:line="276" w:lineRule="auto"/>
+              <w:rPr>
+                <w:rFonts w:ascii="Arial" w:hAnsi="Arial" w:cs="Arial"/>
+              </w:rPr>
+            </w:pPr>
+            <w:r>
+              <w:rPr>
+                <w:rFonts w:ascii="Arial" w:hAnsi="Arial" w:cs="Arial"/>
+              </w:rPr>
+              <w:t>Translates dynamic, untyped JavaScript Object Notation payloads into native, type-safe C# class properties (</w:t>
+            </w:r>
+            <w:proofErr w:type="spellStart"/>
+            <w:r>
+              <w:rPr>
+                <w:rFonts w:ascii="Arial" w:hAnsi="Arial" w:cs="Arial"/>
+              </w:rPr>
+              <w:t>CountryName</w:t>
+            </w:r>
+            <w:proofErr w:type="spellEnd"/>
+            <w:r>
+              <w:rPr>
+                <w:rFonts w:ascii="Arial" w:hAnsi="Arial" w:cs="Arial"/>
+              </w:rPr>
+              <w:t xml:space="preserve">, </w:t>
+            </w:r>
+            <w:proofErr w:type="spellStart"/>
+            <w:r>
+              <w:rPr>
+                <w:rFonts w:ascii="Arial" w:hAnsi="Arial" w:cs="Arial"/>
+              </w:rPr>
+              <w:t>CountryFlags</w:t>
+            </w:r>
+            <w:proofErr w:type="spellEnd"/>
+            <w:r>
+              <w:rPr>
+                <w:rFonts w:ascii="Arial" w:hAnsi="Arial" w:cs="Arial"/>
+              </w:rPr>
+              <w:t xml:space="preserve">, </w:t>
+            </w:r>
+            <w:proofErr w:type="spellStart"/>
+            <w:r>
+              <w:rPr>
+                <w:rFonts w:ascii="Arial" w:hAnsi="Arial" w:cs="Arial"/>
+              </w:rPr>
+              <w:t>CurrencyDetail</w:t>
+            </w:r>
+            <w:proofErr w:type="spellEnd"/>
+            <w:r>
+              <w:rPr>
+                <w:rFonts w:ascii="Arial" w:hAnsi="Arial" w:cs="Arial"/>
+              </w:rPr>
+              <w:t>).</w:t>
             </w:r>
           </w:p>
         </w:tc>
@@ -541,16 +1407,12 @@
     </w:tbl>
     <w:p>
       <w:pPr>
-        <w:pStyle w:val="TipText"/>
-      </w:pPr>
-    </w:p>
-    <w:p>
-      <w:pPr>
         <w:pStyle w:val="Heading1"/>
-        <w:ind w:firstLine="360"/>
+        <w:spacing w:line="276" w:lineRule="auto"/>
       </w:pPr>
       <w:r>
-        <w:t>Error handling &amp; network resilience</w:t>
+        <w:lastRenderedPageBreak/>
+        <w:t>4. Project Directory &amp; Solution Structure</w:t>
       </w:r>
     </w:p>
     <w:tbl>
@@ -573,7 +1435,7 @@
           </w:tcPr>
           <w:p>
             <w:pPr>
-              <w:spacing w:after="0"/>
+              <w:spacing w:after="0" w:line="276" w:lineRule="auto"/>
               <w:jc w:val="left"/>
             </w:pPr>
           </w:p>
@@ -585,25 +1447,16 @@
           </w:tcPr>
           <w:p>
             <w:pPr>
-              <w:spacing w:after="0"/>
+              <w:spacing w:after="0" w:line="276" w:lineRule="auto"/>
               <w:cnfStyle w:val="000000000000" w:firstRow="0" w:lastRow="0" w:firstColumn="0" w:lastColumn="0" w:oddVBand="0" w:evenVBand="0" w:oddHBand="0" w:evenHBand="0" w:firstRowFirstColumn="0" w:firstRowLastColumn="0" w:lastRowFirstColumn="0" w:lastRowLastColumn="0"/>
             </w:pPr>
             <w:r>
-              <w:t xml:space="preserve">To prevent application crashes and maintain a smooth user experience, the </w:t>
-            </w:r>
-          </w:p>
-          <w:p>
-            <w:pPr>
-              <w:spacing w:after="0"/>
-              <w:cnfStyle w:val="000000000000" w:firstRow="0" w:lastRow="0" w:firstColumn="0" w:lastColumn="0" w:oddVBand="0" w:evenVBand="0" w:oddHBand="0" w:evenHBand="0" w:firstRowFirstColumn="0" w:firstRowLastColumn="0" w:lastRowFirstColumn="0" w:lastRowLastColumn="0"/>
-            </w:pPr>
-            <w:r>
-              <w:t>CountryService handles several network scenarios:</w:t>
-            </w:r>
-          </w:p>
-          <w:p>
-            <w:pPr>
-              <w:spacing w:after="0"/>
+              <w:t>The solution strictly adheres to standard separation of concerns and modular software engineering patterns. Core responsibilities are isolated across dedicated namespace layers:</w:t>
+            </w:r>
+          </w:p>
+          <w:p>
+            <w:pPr>
+              <w:spacing w:after="0" w:line="276" w:lineRule="auto"/>
               <w:cnfStyle w:val="000000000000" w:firstRow="0" w:lastRow="0" w:firstColumn="0" w:lastColumn="0" w:oddVBand="0" w:evenVBand="0" w:oddHBand="0" w:evenHBand="0" w:firstRowFirstColumn="0" w:firstRowLastColumn="0" w:lastRowFirstColumn="0" w:lastRowLastColumn="0"/>
             </w:pPr>
           </w:p>
@@ -612,56 +1465,1271 @@
               <w:pStyle w:val="ListParagraph"/>
               <w:numPr>
                 <w:ilvl w:val="0"/>
-                <w:numId w:val="21"/>
+                <w:numId w:val="29"/>
               </w:numPr>
-              <w:spacing w:after="0"/>
+              <w:spacing w:after="0" w:line="276" w:lineRule="auto"/>
               <w:cnfStyle w:val="000000000000" w:firstRow="0" w:lastRow="0" w:firstColumn="0" w:lastColumn="0" w:oddVBand="0" w:evenVBand="0" w:oddHBand="0" w:evenHBand="0" w:firstRowFirstColumn="0" w:firstRowLastColumn="0" w:lastRowFirstColumn="0" w:lastRowLastColumn="0"/>
-            </w:pPr>
-            <w:r>
-              <w:t>Connection Timeouts: 15-second HttpClient timeout limit.</w:t>
-            </w:r>
+              <w:rPr>
+                <w:lang w:val="en-NZ"/>
+              </w:rPr>
+            </w:pPr>
+            <w:r>
+              <w:rPr>
+                <w:b/>
+                <w:bCs/>
+                <w:lang w:val="en-NZ"/>
+              </w:rPr>
+              <w:t>Models/</w:t>
+            </w:r>
+            <w:r>
+              <w:rPr>
+                <w:lang w:val="en-NZ"/>
+              </w:rPr>
+              <w:t xml:space="preserve">: Encapsulates strongly typed data entities and UI binding helpers. </w:t>
+            </w:r>
+          </w:p>
+          <w:p>
+            <w:pPr>
+              <w:pStyle w:val="ListParagraph"/>
+              <w:numPr>
+                <w:ilvl w:val="1"/>
+                <w:numId w:val="29"/>
+              </w:numPr>
+              <w:spacing w:after="0" w:line="276" w:lineRule="auto"/>
+              <w:cnfStyle w:val="000000000000" w:firstRow="0" w:lastRow="0" w:firstColumn="0" w:lastColumn="0" w:oddVBand="0" w:evenVBand="0" w:oddHBand="0" w:evenHBand="0" w:firstRowFirstColumn="0" w:firstRowLastColumn="0" w:lastRowFirstColumn="0" w:lastRowLastColumn="0"/>
+              <w:rPr>
+                <w:lang w:val="en-NZ"/>
+              </w:rPr>
+            </w:pPr>
+            <w:proofErr w:type="spellStart"/>
+            <w:r>
+              <w:rPr>
+                <w:b/>
+                <w:bCs/>
+                <w:lang w:val="en-NZ"/>
+              </w:rPr>
+              <w:t>Country.cs</w:t>
+            </w:r>
+            <w:proofErr w:type="spellEnd"/>
+            <w:r>
+              <w:rPr>
+                <w:lang w:val="en-NZ"/>
+              </w:rPr>
+              <w:t>: Primary entity model defining raw properties, formatting helpers (</w:t>
+            </w:r>
+            <w:proofErr w:type="spellStart"/>
+            <w:r>
+              <w:rPr>
+                <w:lang w:val="en-NZ"/>
+              </w:rPr>
+              <w:t>FormattedPopulation</w:t>
+            </w:r>
+            <w:proofErr w:type="spellEnd"/>
+            <w:r>
+              <w:rPr>
+                <w:lang w:val="en-NZ"/>
+              </w:rPr>
+              <w:t xml:space="preserve">, </w:t>
+            </w:r>
+            <w:proofErr w:type="spellStart"/>
+            <w:r>
+              <w:rPr>
+                <w:lang w:val="en-NZ"/>
+              </w:rPr>
+              <w:t>CapitalDisplay</w:t>
+            </w:r>
+            <w:proofErr w:type="spellEnd"/>
+            <w:r>
+              <w:rPr>
+                <w:lang w:val="en-NZ"/>
+              </w:rPr>
+              <w:t xml:space="preserve">), and display properties. </w:t>
+            </w:r>
+          </w:p>
+          <w:p>
+            <w:pPr>
+              <w:pStyle w:val="ListParagraph"/>
+              <w:numPr>
+                <w:ilvl w:val="1"/>
+                <w:numId w:val="29"/>
+              </w:numPr>
+              <w:spacing w:after="0" w:line="276" w:lineRule="auto"/>
+              <w:cnfStyle w:val="000000000000" w:firstRow="0" w:lastRow="0" w:firstColumn="0" w:lastColumn="0" w:oddVBand="0" w:evenVBand="0" w:oddHBand="0" w:evenHBand="0" w:firstRowFirstColumn="0" w:firstRowLastColumn="0" w:lastRowFirstColumn="0" w:lastRowLastColumn="0"/>
+              <w:rPr>
+                <w:lang w:val="en-NZ"/>
+              </w:rPr>
+            </w:pPr>
           </w:p>
           <w:p>
             <w:pPr>
               <w:pStyle w:val="ListParagraph"/>
               <w:numPr>
                 <w:ilvl w:val="0"/>
-                <w:numId w:val="21"/>
+                <w:numId w:val="29"/>
               </w:numPr>
-              <w:spacing w:after="0"/>
+              <w:spacing w:after="0" w:line="276" w:lineRule="auto"/>
               <w:cnfStyle w:val="000000000000" w:firstRow="0" w:lastRow="0" w:firstColumn="0" w:lastColumn="0" w:oddVBand="0" w:evenVBand="0" w:oddHBand="0" w:evenHBand="0" w:firstRowFirstColumn="0" w:firstRowLastColumn="0" w:lastRowFirstColumn="0" w:lastRowLastColumn="0"/>
-            </w:pPr>
-            <w:r>
-              <w:t>Network Exceptions (HttpRequestException): User-friendly UI messages shown when offline.</w:t>
-            </w:r>
+              <w:rPr>
+                <w:lang w:val="en-NZ"/>
+              </w:rPr>
+            </w:pPr>
+            <w:r>
+              <w:rPr>
+                <w:b/>
+                <w:bCs/>
+                <w:lang w:val="en-NZ"/>
+              </w:rPr>
+              <w:t>Services/</w:t>
+            </w:r>
+            <w:r>
+              <w:rPr>
+                <w:lang w:val="en-NZ"/>
+              </w:rPr>
+              <w:t xml:space="preserve">: Manages remote HTTP network calls, dynamic JSON parsing, fallback data, and local persistence. </w:t>
+            </w:r>
+          </w:p>
+          <w:p>
+            <w:pPr>
+              <w:pStyle w:val="ListParagraph"/>
+              <w:numPr>
+                <w:ilvl w:val="1"/>
+                <w:numId w:val="29"/>
+              </w:numPr>
+              <w:spacing w:after="0" w:line="276" w:lineRule="auto"/>
+              <w:cnfStyle w:val="000000000000" w:firstRow="0" w:lastRow="0" w:firstColumn="0" w:lastColumn="0" w:oddVBand="0" w:evenVBand="0" w:oddHBand="0" w:evenHBand="0" w:firstRowFirstColumn="0" w:firstRowLastColumn="0" w:lastRowFirstColumn="0" w:lastRowLastColumn="0"/>
+              <w:rPr>
+                <w:lang w:val="en-NZ"/>
+              </w:rPr>
+            </w:pPr>
+            <w:proofErr w:type="spellStart"/>
+            <w:r>
+              <w:rPr>
+                <w:b/>
+                <w:bCs/>
+                <w:lang w:val="en-NZ"/>
+              </w:rPr>
+              <w:t>CountryService.cs</w:t>
+            </w:r>
+            <w:proofErr w:type="spellEnd"/>
+            <w:r>
+              <w:rPr>
+                <w:lang w:val="en-NZ"/>
+              </w:rPr>
+              <w:t xml:space="preserve">: Handles </w:t>
+            </w:r>
+            <w:proofErr w:type="spellStart"/>
+            <w:r>
+              <w:rPr>
+                <w:lang w:val="en-NZ"/>
+              </w:rPr>
+              <w:t>HttpClient</w:t>
+            </w:r>
+            <w:proofErr w:type="spellEnd"/>
+            <w:r>
+              <w:rPr>
+                <w:lang w:val="en-NZ"/>
+              </w:rPr>
+              <w:t xml:space="preserve"> lifecycle, GET endpoint communication, JSON node parsing, and emergency offline fallback datasets. </w:t>
+            </w:r>
+          </w:p>
+          <w:p>
+            <w:pPr>
+              <w:pStyle w:val="ListParagraph"/>
+              <w:numPr>
+                <w:ilvl w:val="1"/>
+                <w:numId w:val="29"/>
+              </w:numPr>
+              <w:spacing w:after="0" w:line="276" w:lineRule="auto"/>
+              <w:cnfStyle w:val="000000000000" w:firstRow="0" w:lastRow="0" w:firstColumn="0" w:lastColumn="0" w:oddVBand="0" w:evenVBand="0" w:oddHBand="0" w:evenHBand="0" w:firstRowFirstColumn="0" w:firstRowLastColumn="0" w:lastRowFirstColumn="0" w:lastRowLastColumn="0"/>
+              <w:rPr>
+                <w:lang w:val="en-NZ"/>
+              </w:rPr>
+            </w:pPr>
+            <w:proofErr w:type="spellStart"/>
+            <w:r>
+              <w:rPr>
+                <w:b/>
+                <w:bCs/>
+                <w:lang w:val="en-NZ"/>
+              </w:rPr>
+              <w:t>FavoritesService.cs</w:t>
+            </w:r>
+            <w:proofErr w:type="spellEnd"/>
+            <w:r>
+              <w:rPr>
+                <w:lang w:val="en-NZ"/>
+              </w:rPr>
+              <w:t xml:space="preserve">: Controls persistent local storage for bookmarked </w:t>
+            </w:r>
+            <w:r>
+              <w:rPr>
+                <w:lang w:val="en-NZ"/>
+              </w:rPr>
+              <w:t>favourite</w:t>
+            </w:r>
+            <w:r>
+              <w:rPr>
+                <w:lang w:val="en-NZ"/>
+              </w:rPr>
+              <w:t xml:space="preserve"> countries utilizing native Preferences APIs. </w:t>
+            </w:r>
+          </w:p>
+          <w:p>
+            <w:pPr>
+              <w:pStyle w:val="ListParagraph"/>
+              <w:spacing w:after="0" w:line="276" w:lineRule="auto"/>
+              <w:ind w:left="1080"/>
+              <w:cnfStyle w:val="000000000000" w:firstRow="0" w:lastRow="0" w:firstColumn="0" w:lastColumn="0" w:oddVBand="0" w:evenVBand="0" w:oddHBand="0" w:evenHBand="0" w:firstRowFirstColumn="0" w:firstRowLastColumn="0" w:lastRowFirstColumn="0" w:lastRowLastColumn="0"/>
+              <w:rPr>
+                <w:lang w:val="en-NZ"/>
+              </w:rPr>
+            </w:pPr>
           </w:p>
           <w:p>
             <w:pPr>
               <w:pStyle w:val="ListParagraph"/>
               <w:numPr>
                 <w:ilvl w:val="0"/>
-                <w:numId w:val="21"/>
+                <w:numId w:val="29"/>
               </w:numPr>
-              <w:spacing w:after="0"/>
+              <w:spacing w:after="0" w:line="276" w:lineRule="auto"/>
               <w:cnfStyle w:val="000000000000" w:firstRow="0" w:lastRow="0" w:firstColumn="0" w:lastColumn="0" w:oddVBand="0" w:evenVBand="0" w:oddHBand="0" w:evenHBand="0" w:firstRowFirstColumn="0" w:firstRowLastColumn="0" w:lastRowFirstColumn="0" w:lastRowLastColumn="0"/>
-            </w:pPr>
-            <w:r>
-              <w:t>Retry Functionality: A "Reload" button allowing users to re-trigger API requests without restarting the application.</w:t>
+              <w:rPr>
+                <w:lang w:val="en-NZ"/>
+              </w:rPr>
+            </w:pPr>
+            <w:r>
+              <w:rPr>
+                <w:b/>
+                <w:bCs/>
+                <w:lang w:val="en-NZ"/>
+              </w:rPr>
+              <w:t>Views/</w:t>
+            </w:r>
+            <w:r>
+              <w:rPr>
+                <w:lang w:val="en-NZ"/>
+              </w:rPr>
+              <w:t xml:space="preserve">: Contains XAML user interface layouts and code-behind interaction handlers. </w:t>
+            </w:r>
+          </w:p>
+          <w:p>
+            <w:pPr>
+              <w:pStyle w:val="ListParagraph"/>
+              <w:numPr>
+                <w:ilvl w:val="1"/>
+                <w:numId w:val="29"/>
+              </w:numPr>
+              <w:spacing w:after="0" w:line="276" w:lineRule="auto"/>
+              <w:cnfStyle w:val="000000000000" w:firstRow="0" w:lastRow="0" w:firstColumn="0" w:lastColumn="0" w:oddVBand="0" w:evenVBand="0" w:oddHBand="0" w:evenHBand="0" w:firstRowFirstColumn="0" w:firstRowLastColumn="0" w:lastRowFirstColumn="0" w:lastRowLastColumn="0"/>
+              <w:rPr>
+                <w:lang w:val="en-NZ"/>
+              </w:rPr>
+            </w:pPr>
+            <w:proofErr w:type="spellStart"/>
+            <w:r>
+              <w:rPr>
+                <w:b/>
+                <w:bCs/>
+                <w:lang w:val="en-NZ"/>
+              </w:rPr>
+              <w:t>CountriesPage.xaml</w:t>
+            </w:r>
+            <w:proofErr w:type="spellEnd"/>
+            <w:r>
+              <w:rPr>
+                <w:lang w:val="en-NZ"/>
+              </w:rPr>
+              <w:t xml:space="preserve">: Main gallery view hosting the </w:t>
+            </w:r>
+            <w:proofErr w:type="spellStart"/>
+            <w:r>
+              <w:rPr>
+                <w:lang w:val="en-NZ"/>
+              </w:rPr>
+              <w:t>SearchBar</w:t>
+            </w:r>
+            <w:proofErr w:type="spellEnd"/>
+            <w:r>
+              <w:rPr>
+                <w:lang w:val="en-NZ"/>
+              </w:rPr>
+              <w:t xml:space="preserve">, region filter Picker, sort selection, stats header, and </w:t>
+            </w:r>
+            <w:proofErr w:type="spellStart"/>
+            <w:r>
+              <w:rPr>
+                <w:lang w:val="en-NZ"/>
+              </w:rPr>
+              <w:t>CollectionView</w:t>
+            </w:r>
+            <w:proofErr w:type="spellEnd"/>
+            <w:r>
+              <w:rPr>
+                <w:lang w:val="en-NZ"/>
+              </w:rPr>
+              <w:t xml:space="preserve">. </w:t>
+            </w:r>
+          </w:p>
+          <w:p>
+            <w:pPr>
+              <w:pStyle w:val="ListParagraph"/>
+              <w:numPr>
+                <w:ilvl w:val="2"/>
+                <w:numId w:val="29"/>
+              </w:numPr>
+              <w:spacing w:after="0" w:line="276" w:lineRule="auto"/>
+              <w:cnfStyle w:val="000000000000" w:firstRow="0" w:lastRow="0" w:firstColumn="0" w:lastColumn="0" w:oddVBand="0" w:evenVBand="0" w:oddHBand="0" w:evenHBand="0" w:firstRowFirstColumn="0" w:firstRowLastColumn="0" w:lastRowFirstColumn="0" w:lastRowLastColumn="0"/>
+              <w:rPr>
+                <w:lang w:val="en-NZ"/>
+              </w:rPr>
+            </w:pPr>
+            <w:proofErr w:type="spellStart"/>
+            <w:r>
+              <w:rPr>
+                <w:b/>
+                <w:bCs/>
+                <w:lang w:val="en-NZ"/>
+              </w:rPr>
+              <w:t>CountriesPage.xaml.cs</w:t>
+            </w:r>
+            <w:proofErr w:type="spellEnd"/>
+            <w:r>
+              <w:rPr>
+                <w:lang w:val="en-NZ"/>
+              </w:rPr>
+              <w:t xml:space="preserve">: View lifecycle execution, reactive query filtering, and event routing. </w:t>
+            </w:r>
+          </w:p>
+          <w:p>
+            <w:pPr>
+              <w:pStyle w:val="ListParagraph"/>
+              <w:numPr>
+                <w:ilvl w:val="1"/>
+                <w:numId w:val="29"/>
+              </w:numPr>
+              <w:spacing w:after="0" w:line="276" w:lineRule="auto"/>
+              <w:cnfStyle w:val="000000000000" w:firstRow="0" w:lastRow="0" w:firstColumn="0" w:lastColumn="0" w:oddVBand="0" w:evenVBand="0" w:oddHBand="0" w:evenHBand="0" w:firstRowFirstColumn="0" w:firstRowLastColumn="0" w:lastRowFirstColumn="0" w:lastRowLastColumn="0"/>
+              <w:rPr>
+                <w:lang w:val="en-NZ"/>
+              </w:rPr>
+            </w:pPr>
+            <w:proofErr w:type="spellStart"/>
+            <w:r>
+              <w:rPr>
+                <w:b/>
+                <w:bCs/>
+                <w:lang w:val="en-NZ"/>
+              </w:rPr>
+              <w:t>CountryDetailsPage.xaml</w:t>
+            </w:r>
+            <w:proofErr w:type="spellEnd"/>
+            <w:r>
+              <w:rPr>
+                <w:lang w:val="en-NZ"/>
+              </w:rPr>
+              <w:t xml:space="preserve">: Comprehensive metadata screen featuring high-resolution flags, demographic metrics, and action controls. </w:t>
+            </w:r>
+          </w:p>
+          <w:p>
+            <w:pPr>
+              <w:pStyle w:val="ListParagraph"/>
+              <w:numPr>
+                <w:ilvl w:val="2"/>
+                <w:numId w:val="29"/>
+              </w:numPr>
+              <w:spacing w:after="0" w:line="276" w:lineRule="auto"/>
+              <w:cnfStyle w:val="000000000000" w:firstRow="0" w:lastRow="0" w:firstColumn="0" w:lastColumn="0" w:oddVBand="0" w:evenVBand="0" w:oddHBand="0" w:evenHBand="0" w:firstRowFirstColumn="0" w:firstRowLastColumn="0" w:lastRowFirstColumn="0" w:lastRowLastColumn="0"/>
+              <w:rPr>
+                <w:lang w:val="en-NZ"/>
+              </w:rPr>
+            </w:pPr>
+            <w:proofErr w:type="spellStart"/>
+            <w:r>
+              <w:rPr>
+                <w:b/>
+                <w:bCs/>
+                <w:lang w:val="en-NZ"/>
+              </w:rPr>
+              <w:t>CountryDetailsPage.xaml.cs</w:t>
+            </w:r>
+            <w:proofErr w:type="spellEnd"/>
+            <w:r>
+              <w:rPr>
+                <w:lang w:val="en-NZ"/>
+              </w:rPr>
+              <w:t xml:space="preserve">: Native OS launcher interactions, including Google Maps navigation and platform Share Sheet invocation. </w:t>
+            </w:r>
+          </w:p>
+          <w:p>
+            <w:pPr>
+              <w:pStyle w:val="ListParagraph"/>
+              <w:spacing w:after="0" w:line="276" w:lineRule="auto"/>
+              <w:ind w:left="1800"/>
+              <w:cnfStyle w:val="000000000000" w:firstRow="0" w:lastRow="0" w:firstColumn="0" w:lastColumn="0" w:oddVBand="0" w:evenVBand="0" w:oddHBand="0" w:evenHBand="0" w:firstRowFirstColumn="0" w:firstRowLastColumn="0" w:lastRowFirstColumn="0" w:lastRowLastColumn="0"/>
+              <w:rPr>
+                <w:lang w:val="en-NZ"/>
+              </w:rPr>
+            </w:pPr>
+          </w:p>
+          <w:p>
+            <w:pPr>
+              <w:pStyle w:val="ListParagraph"/>
+              <w:numPr>
+                <w:ilvl w:val="0"/>
+                <w:numId w:val="29"/>
+              </w:numPr>
+              <w:spacing w:after="0" w:line="276" w:lineRule="auto"/>
+              <w:cnfStyle w:val="000000000000" w:firstRow="0" w:lastRow="0" w:firstColumn="0" w:lastColumn="0" w:oddVBand="0" w:evenVBand="0" w:oddHBand="0" w:evenHBand="0" w:firstRowFirstColumn="0" w:firstRowLastColumn="0" w:lastRowFirstColumn="0" w:lastRowLastColumn="0"/>
+              <w:rPr>
+                <w:lang w:val="en-NZ"/>
+              </w:rPr>
+            </w:pPr>
+            <w:r>
+              <w:rPr>
+                <w:b/>
+                <w:bCs/>
+                <w:lang w:val="en-NZ"/>
+              </w:rPr>
+              <w:t>docs/</w:t>
+            </w:r>
+            <w:r>
+              <w:rPr>
+                <w:lang w:val="en-NZ"/>
+              </w:rPr>
+              <w:t xml:space="preserve">: Stores formal technical documentation, testing execution logs, and issue tracking history. </w:t>
+            </w:r>
+          </w:p>
+          <w:p>
+            <w:pPr>
+              <w:pStyle w:val="ListParagraph"/>
+              <w:numPr>
+                <w:ilvl w:val="1"/>
+                <w:numId w:val="29"/>
+              </w:numPr>
+              <w:spacing w:after="0" w:line="276" w:lineRule="auto"/>
+              <w:cnfStyle w:val="000000000000" w:firstRow="0" w:lastRow="0" w:firstColumn="0" w:lastColumn="0" w:oddVBand="0" w:evenVBand="0" w:oddHBand="0" w:evenHBand="0" w:firstRowFirstColumn="0" w:firstRowLastColumn="0" w:lastRowFirstColumn="0" w:lastRowLastColumn="0"/>
+              <w:rPr>
+                <w:lang w:val="en-NZ"/>
+              </w:rPr>
+            </w:pPr>
+            <w:r>
+              <w:rPr>
+                <w:b/>
+                <w:bCs/>
+                <w:lang w:val="en-NZ"/>
+              </w:rPr>
+              <w:t>README.md</w:t>
+            </w:r>
+            <w:r>
+              <w:rPr>
+                <w:lang w:val="en-NZ"/>
+              </w:rPr>
+              <w:t xml:space="preserve">: Master technical system specification and architecture overview. </w:t>
+            </w:r>
+          </w:p>
+          <w:p>
+            <w:pPr>
+              <w:pStyle w:val="ListParagraph"/>
+              <w:numPr>
+                <w:ilvl w:val="1"/>
+                <w:numId w:val="29"/>
+              </w:numPr>
+              <w:spacing w:after="0" w:line="276" w:lineRule="auto"/>
+              <w:cnfStyle w:val="000000000000" w:firstRow="0" w:lastRow="0" w:firstColumn="0" w:lastColumn="0" w:oddVBand="0" w:evenVBand="0" w:oddHBand="0" w:evenHBand="0" w:firstRowFirstColumn="0" w:firstRowLastColumn="0" w:lastRowFirstColumn="0" w:lastRowLastColumn="0"/>
+              <w:rPr>
+                <w:lang w:val="en-NZ"/>
+              </w:rPr>
+            </w:pPr>
+            <w:r>
+              <w:rPr>
+                <w:b/>
+                <w:bCs/>
+                <w:lang w:val="en-NZ"/>
+              </w:rPr>
+              <w:t>CountryExplorer_Test_Plan_and_Results.xlsx</w:t>
+            </w:r>
+            <w:r>
+              <w:rPr>
+                <w:lang w:val="en-NZ"/>
+              </w:rPr>
+              <w:t xml:space="preserve">: Detailed test cases, validation steps, and execution matrix. </w:t>
+            </w:r>
+          </w:p>
+          <w:p>
+            <w:pPr>
+              <w:pStyle w:val="ListParagraph"/>
+              <w:numPr>
+                <w:ilvl w:val="1"/>
+                <w:numId w:val="29"/>
+              </w:numPr>
+              <w:spacing w:after="0" w:line="276" w:lineRule="auto"/>
+              <w:cnfStyle w:val="000000000000" w:firstRow="0" w:lastRow="0" w:firstColumn="0" w:lastColumn="0" w:oddVBand="0" w:evenVBand="0" w:oddHBand="0" w:evenHBand="0" w:firstRowFirstColumn="0" w:firstRowLastColumn="0" w:lastRowFirstColumn="0" w:lastRowLastColumn="0"/>
+              <w:rPr>
+                <w:lang w:val="en-NZ"/>
+              </w:rPr>
+            </w:pPr>
+            <w:r>
+              <w:rPr>
+                <w:b/>
+                <w:bCs/>
+                <w:lang w:val="en-NZ"/>
+              </w:rPr>
+              <w:t>CountryExplorer_Issue_Tracking_Log.xlsx</w:t>
+            </w:r>
+            <w:r>
+              <w:rPr>
+                <w:lang w:val="en-NZ"/>
+              </w:rPr>
+              <w:t xml:space="preserve">: Issue resolution records, bug fix history, and quality assurance logs. </w:t>
+            </w:r>
+          </w:p>
+          <w:p>
+            <w:pPr>
+              <w:pStyle w:val="ListParagraph"/>
+              <w:spacing w:after="0" w:line="276" w:lineRule="auto"/>
+              <w:ind w:left="1080"/>
+              <w:cnfStyle w:val="000000000000" w:firstRow="0" w:lastRow="0" w:firstColumn="0" w:lastColumn="0" w:oddVBand="0" w:evenVBand="0" w:oddHBand="0" w:evenHBand="0" w:firstRowFirstColumn="0" w:firstRowLastColumn="0" w:lastRowFirstColumn="0" w:lastRowLastColumn="0"/>
+              <w:rPr>
+                <w:lang w:val="en-NZ"/>
+              </w:rPr>
+            </w:pPr>
+          </w:p>
+          <w:p>
+            <w:pPr>
+              <w:pStyle w:val="ListParagraph"/>
+              <w:numPr>
+                <w:ilvl w:val="0"/>
+                <w:numId w:val="29"/>
+              </w:numPr>
+              <w:spacing w:after="0" w:line="276" w:lineRule="auto"/>
+              <w:cnfStyle w:val="000000000000" w:firstRow="0" w:lastRow="0" w:firstColumn="0" w:lastColumn="0" w:oddVBand="0" w:evenVBand="0" w:oddHBand="0" w:evenHBand="0" w:firstRowFirstColumn="0" w:firstRowLastColumn="0" w:lastRowFirstColumn="0" w:lastRowLastColumn="0"/>
+              <w:rPr>
+                <w:lang w:val="en-NZ"/>
+              </w:rPr>
+            </w:pPr>
+            <w:r>
+              <w:rPr>
+                <w:b/>
+                <w:bCs/>
+                <w:lang w:val="en-NZ"/>
+              </w:rPr>
+              <w:t>Resources/</w:t>
+            </w:r>
+            <w:r>
+              <w:rPr>
+                <w:lang w:val="en-NZ"/>
+              </w:rPr>
+              <w:t xml:space="preserve">: Contains cross-platform application assets, app icons, splash screens, custom fonts, and global </w:t>
+            </w:r>
+            <w:r>
+              <w:rPr>
+                <w:lang w:val="en-NZ"/>
+              </w:rPr>
+              <w:t>colour</w:t>
+            </w:r>
+            <w:r>
+              <w:rPr>
+                <w:lang w:val="en-NZ"/>
+              </w:rPr>
+              <w:t xml:space="preserve"> dictionaries. </w:t>
+            </w:r>
+          </w:p>
+          <w:p>
+            <w:pPr>
+              <w:pStyle w:val="ListParagraph"/>
+              <w:spacing w:after="0" w:line="276" w:lineRule="auto"/>
+              <w:ind w:left="360"/>
+              <w:cnfStyle w:val="000000000000" w:firstRow="0" w:lastRow="0" w:firstColumn="0" w:lastColumn="0" w:oddVBand="0" w:evenVBand="0" w:oddHBand="0" w:evenHBand="0" w:firstRowFirstColumn="0" w:firstRowLastColumn="0" w:lastRowFirstColumn="0" w:lastRowLastColumn="0"/>
+              <w:rPr>
+                <w:lang w:val="en-NZ"/>
+              </w:rPr>
+            </w:pPr>
+          </w:p>
+          <w:p>
+            <w:pPr>
+              <w:pStyle w:val="ListParagraph"/>
+              <w:numPr>
+                <w:ilvl w:val="0"/>
+                <w:numId w:val="29"/>
+              </w:numPr>
+              <w:spacing w:after="0" w:line="276" w:lineRule="auto"/>
+              <w:cnfStyle w:val="000000000000" w:firstRow="0" w:lastRow="0" w:firstColumn="0" w:lastColumn="0" w:oddVBand="0" w:evenVBand="0" w:oddHBand="0" w:evenHBand="0" w:firstRowFirstColumn="0" w:firstRowLastColumn="0" w:lastRowFirstColumn="0" w:lastRowLastColumn="0"/>
+              <w:rPr>
+                <w:lang w:val="en-NZ"/>
+              </w:rPr>
+            </w:pPr>
+            <w:proofErr w:type="spellStart"/>
+            <w:r>
+              <w:rPr>
+                <w:b/>
+                <w:bCs/>
+                <w:lang w:val="en-NZ"/>
+              </w:rPr>
+              <w:t>AppShell.xaml</w:t>
+            </w:r>
+            <w:proofErr w:type="spellEnd"/>
+            <w:r>
+              <w:rPr>
+                <w:lang w:val="en-NZ"/>
+              </w:rPr>
+              <w:t xml:space="preserve">: Defines the visual hierarchy, Shell routing tables, and global app navigation container. </w:t>
+            </w:r>
+          </w:p>
+          <w:p>
+            <w:pPr>
+              <w:spacing w:after="0" w:line="276" w:lineRule="auto"/>
+              <w:cnfStyle w:val="000000000000" w:firstRow="0" w:lastRow="0" w:firstColumn="0" w:lastColumn="0" w:oddVBand="0" w:evenVBand="0" w:oddHBand="0" w:evenHBand="0" w:firstRowFirstColumn="0" w:firstRowLastColumn="0" w:lastRowFirstColumn="0" w:lastRowLastColumn="0"/>
+              <w:rPr>
+                <w:lang w:val="en-NZ"/>
+              </w:rPr>
+            </w:pPr>
+          </w:p>
+          <w:p>
+            <w:pPr>
+              <w:pStyle w:val="ListParagraph"/>
+              <w:numPr>
+                <w:ilvl w:val="0"/>
+                <w:numId w:val="29"/>
+              </w:numPr>
+              <w:spacing w:after="0" w:line="276" w:lineRule="auto"/>
+              <w:cnfStyle w:val="000000000000" w:firstRow="0" w:lastRow="0" w:firstColumn="0" w:lastColumn="0" w:oddVBand="0" w:evenVBand="0" w:oddHBand="0" w:evenHBand="0" w:firstRowFirstColumn="0" w:firstRowLastColumn="0" w:lastRowFirstColumn="0" w:lastRowLastColumn="0"/>
+              <w:rPr>
+                <w:lang w:val="en-NZ"/>
+              </w:rPr>
+            </w:pPr>
+            <w:proofErr w:type="spellStart"/>
+            <w:r>
+              <w:rPr>
+                <w:b/>
+                <w:bCs/>
+                <w:lang w:val="en-NZ"/>
+              </w:rPr>
+              <w:t>MauiProgram.cs</w:t>
+            </w:r>
+            <w:proofErr w:type="spellEnd"/>
+            <w:r>
+              <w:rPr>
+                <w:lang w:val="en-NZ"/>
+              </w:rPr>
+              <w:t xml:space="preserve">: Configures the cross-platform builder, dependency injection container, custom fonts, and app bootstrapping. </w:t>
             </w:r>
           </w:p>
           <w:p>
             <w:pPr>
               <w:pStyle w:val="TipText"/>
-              <w:spacing w:after="0"/>
+              <w:spacing w:after="0" w:line="276" w:lineRule="auto"/>
               <w:cnfStyle w:val="000000000000" w:firstRow="0" w:lastRow="0" w:firstColumn="0" w:lastColumn="0" w:oddVBand="0" w:evenVBand="0" w:oddHBand="0" w:evenHBand="0" w:firstRowFirstColumn="0" w:firstRowLastColumn="0" w:lastRowFirstColumn="0" w:lastRowLastColumn="0"/>
             </w:pPr>
           </w:p>
         </w:tc>
       </w:tr>
     </w:tbl>
-    <w:p/>
+    <w:p>
+      <w:pPr>
+        <w:spacing w:line="276" w:lineRule="auto"/>
+        <w:rPr>
+          <w:rFonts w:asciiTheme="majorHAnsi" w:hAnsiTheme="majorHAnsi" w:cs="Times New Roman (Body CS)"/>
+          <w:b/>
+          <w:bCs/>
+          <w:caps/>
+          <w:color w:val="EDA516" w:themeColor="accent4"/>
+          <w:spacing w:val="10"/>
+          <w:sz w:val="28"/>
+        </w:rPr>
+      </w:pPr>
+      <w:r>
+        <w:rPr>
+          <w:rFonts w:asciiTheme="majorHAnsi" w:hAnsiTheme="majorHAnsi" w:cs="Times New Roman (Body CS)"/>
+          <w:b/>
+          <w:bCs/>
+          <w:caps/>
+          <w:color w:val="EDA516" w:themeColor="accent4"/>
+          <w:spacing w:val="10"/>
+          <w:sz w:val="28"/>
+        </w:rPr>
+        <w:t>5. NETWORK RESILIENCE, ERROR HANDLING &amp; SYSTEM QUALITY</w:t>
+      </w:r>
+    </w:p>
+    <w:p>
+      <w:pPr>
+        <w:spacing w:line="276" w:lineRule="auto"/>
+        <w:rPr>
+          <w:lang w:val="en-NZ"/>
+        </w:rPr>
+      </w:pPr>
+      <w:r>
+        <w:rPr>
+          <w:lang w:val="en-NZ"/>
+        </w:rPr>
+        <w:t xml:space="preserve">To satisfy enterprise reliability standards and prevent application runtime failures, the platform incorporates defensive programming patterns across all </w:t>
+      </w:r>
+      <w:proofErr w:type="gramStart"/>
+      <w:r>
+        <w:rPr>
+          <w:lang w:val="en-NZ"/>
+        </w:rPr>
+        <w:t>network</w:t>
+      </w:r>
+      <w:proofErr w:type="gramEnd"/>
+      <w:r>
+        <w:rPr>
+          <w:lang w:val="en-NZ"/>
+        </w:rPr>
+        <w:t xml:space="preserve"> I/O operations: </w:t>
+      </w:r>
+    </w:p>
+    <w:p>
+      <w:pPr>
+        <w:numPr>
+          <w:ilvl w:val="0"/>
+          <w:numId w:val="30"/>
+        </w:numPr>
+        <w:spacing w:line="276" w:lineRule="auto"/>
+        <w:rPr>
+          <w:lang w:val="en-NZ"/>
+        </w:rPr>
+      </w:pPr>
+      <w:r>
+        <w:rPr>
+          <w:b/>
+          <w:bCs/>
+          <w:lang w:val="en-NZ"/>
+        </w:rPr>
+        <w:lastRenderedPageBreak/>
+        <w:t>Connection Timeout Management</w:t>
+      </w:r>
+      <w:r>
+        <w:rPr>
+          <w:lang w:val="en-NZ"/>
+        </w:rPr>
+        <w:t>: Network operations enforce a strict 15-second execution ceiling (</w:t>
+      </w:r>
+      <w:proofErr w:type="spellStart"/>
+      <w:r>
+        <w:rPr>
+          <w:lang w:val="en-NZ"/>
+        </w:rPr>
+        <w:t>HttpClient.Timeout</w:t>
+      </w:r>
+      <w:proofErr w:type="spellEnd"/>
+      <w:r>
+        <w:rPr>
+          <w:lang w:val="en-NZ"/>
+        </w:rPr>
+        <w:t xml:space="preserve">) to prevent the application from hanging indefinitely during poor cellular connection events. </w:t>
+      </w:r>
+    </w:p>
+    <w:p>
+      <w:pPr>
+        <w:numPr>
+          <w:ilvl w:val="0"/>
+          <w:numId w:val="30"/>
+        </w:numPr>
+        <w:spacing w:line="276" w:lineRule="auto"/>
+        <w:rPr>
+          <w:lang w:val="en-NZ"/>
+        </w:rPr>
+      </w:pPr>
+      <w:r>
+        <w:rPr>
+          <w:b/>
+          <w:bCs/>
+          <w:lang w:val="en-NZ"/>
+        </w:rPr>
+        <w:t>Offline Fallback Dataset</w:t>
+      </w:r>
+      <w:r>
+        <w:rPr>
+          <w:lang w:val="en-NZ"/>
+        </w:rPr>
+        <w:t xml:space="preserve">: If remote endpoints fail to respond or the host device drops internet connectivity, the system automatically redirects to a high-availability local fallback dataset containing complete demographic and geographic metadata. </w:t>
+      </w:r>
+    </w:p>
+    <w:p>
+      <w:pPr>
+        <w:numPr>
+          <w:ilvl w:val="0"/>
+          <w:numId w:val="30"/>
+        </w:numPr>
+        <w:spacing w:line="276" w:lineRule="auto"/>
+        <w:rPr>
+          <w:lang w:val="en-NZ"/>
+        </w:rPr>
+      </w:pPr>
+      <w:r>
+        <w:rPr>
+          <w:b/>
+          <w:bCs/>
+          <w:lang w:val="en-NZ"/>
+        </w:rPr>
+        <w:t>Defensive Property Handling</w:t>
+      </w:r>
+      <w:r>
+        <w:rPr>
+          <w:lang w:val="en-NZ"/>
+        </w:rPr>
+        <w:t xml:space="preserve">: Dynamic null-coalescing expressions in C# models alongside XAML </w:t>
+      </w:r>
+      <w:proofErr w:type="spellStart"/>
+      <w:r>
+        <w:rPr>
+          <w:lang w:val="en-NZ"/>
+        </w:rPr>
+        <w:t>FallbackValue</w:t>
+      </w:r>
+      <w:proofErr w:type="spellEnd"/>
+      <w:r>
+        <w:rPr>
+          <w:lang w:val="en-NZ"/>
+        </w:rPr>
+        <w:t xml:space="preserve"> rules prevent runtime exceptions when processing missing capital cities or currency codes. </w:t>
+      </w:r>
+    </w:p>
+    <w:p>
+      <w:pPr>
+        <w:numPr>
+          <w:ilvl w:val="0"/>
+          <w:numId w:val="30"/>
+        </w:numPr>
+        <w:spacing w:line="276" w:lineRule="auto"/>
+        <w:rPr>
+          <w:lang w:val="en-NZ"/>
+        </w:rPr>
+      </w:pPr>
+      <w:r>
+        <w:rPr>
+          <w:b/>
+          <w:bCs/>
+          <w:lang w:val="en-NZ"/>
+        </w:rPr>
+        <w:t>User-Friendly Error Recovery</w:t>
+      </w:r>
+      <w:r>
+        <w:rPr>
+          <w:lang w:val="en-NZ"/>
+        </w:rPr>
+        <w:t xml:space="preserve">: Technical exception details are caught internally while presenting users with contextual diagnostic notifications alongside interactive </w:t>
+      </w:r>
+      <w:r>
+        <w:rPr>
+          <w:b/>
+          <w:bCs/>
+          <w:lang w:val="en-NZ"/>
+        </w:rPr>
+        <w:t>Reload</w:t>
+      </w:r>
+      <w:r>
+        <w:rPr>
+          <w:lang w:val="en-NZ"/>
+        </w:rPr>
+        <w:t xml:space="preserve"> and </w:t>
+      </w:r>
+      <w:r>
+        <w:rPr>
+          <w:b/>
+          <w:bCs/>
+          <w:lang w:val="en-NZ"/>
+        </w:rPr>
+        <w:t>Try Again</w:t>
+      </w:r>
+      <w:r>
+        <w:rPr>
+          <w:lang w:val="en-NZ"/>
+        </w:rPr>
+        <w:t xml:space="preserve"> controls. </w:t>
+      </w:r>
+    </w:p>
+    <w:p>
+      <w:pPr>
+        <w:tabs>
+          <w:tab w:val="left" w:pos="1680"/>
+        </w:tabs>
+        <w:spacing w:line="276" w:lineRule="auto"/>
+      </w:pPr>
+    </w:p>
+    <w:p>
+      <w:pPr>
+        <w:tabs>
+          <w:tab w:val="left" w:pos="1680"/>
+        </w:tabs>
+        <w:spacing w:line="276" w:lineRule="auto"/>
+        <w:rPr>
+          <w:rFonts w:asciiTheme="majorHAnsi" w:hAnsiTheme="majorHAnsi" w:cs="Times New Roman (Body CS)"/>
+          <w:b/>
+          <w:bCs/>
+          <w:caps/>
+          <w:color w:val="EDA516" w:themeColor="accent4"/>
+          <w:spacing w:val="10"/>
+          <w:sz w:val="28"/>
+        </w:rPr>
+      </w:pPr>
+      <w:r>
+        <w:rPr>
+          <w:rFonts w:asciiTheme="majorHAnsi" w:hAnsiTheme="majorHAnsi" w:cs="Times New Roman (Body CS)"/>
+          <w:b/>
+          <w:bCs/>
+          <w:caps/>
+          <w:color w:val="EDA516" w:themeColor="accent4"/>
+          <w:spacing w:val="10"/>
+          <w:sz w:val="28"/>
+        </w:rPr>
+        <w:t xml:space="preserve">6. </w:t>
+      </w:r>
+      <w:r>
+        <w:rPr>
+          <w:rFonts w:asciiTheme="majorHAnsi" w:hAnsiTheme="majorHAnsi" w:cs="Times New Roman (Body CS)"/>
+          <w:b/>
+          <w:bCs/>
+          <w:caps/>
+          <w:color w:val="EDA516" w:themeColor="accent4"/>
+          <w:spacing w:val="10"/>
+          <w:sz w:val="28"/>
+        </w:rPr>
+        <w:t>DOCUMENT SIGN-OFF &amp; PROJECT CONCLUSION</w:t>
+      </w:r>
+    </w:p>
+    <w:p>
+      <w:pPr>
+        <w:pStyle w:val="ListParagraph"/>
+        <w:tabs>
+          <w:tab w:val="left" w:pos="1680"/>
+        </w:tabs>
+        <w:spacing w:line="276" w:lineRule="auto"/>
+        <w:ind w:left="0"/>
+        <w:rPr>
+          <w:rFonts w:cs="Times New Roman (Body CS)"/>
+          <w:b/>
+          <w:bCs/>
+          <w:color w:val="3D97B6" w:themeColor="accent2"/>
+          <w:spacing w:val="1"/>
+          <w:sz w:val="24"/>
+        </w:rPr>
+      </w:pPr>
+      <w:r>
+        <w:rPr>
+          <w:rFonts w:cs="Times New Roman (Body CS)"/>
+          <w:b/>
+          <w:bCs/>
+          <w:color w:val="3D97B6" w:themeColor="accent2"/>
+          <w:spacing w:val="1"/>
+          <w:sz w:val="24"/>
+        </w:rPr>
+        <w:t>Project Status &amp; Delivery Summary</w:t>
+      </w:r>
+    </w:p>
+    <w:p>
+      <w:pPr>
+        <w:pStyle w:val="ListParagraph"/>
+        <w:tabs>
+          <w:tab w:val="left" w:pos="1680"/>
+        </w:tabs>
+        <w:spacing w:line="276" w:lineRule="auto"/>
+        <w:ind w:left="0"/>
+        <w:rPr>
+          <w:rFonts w:cs="Times New Roman (Body CS)"/>
+          <w:b/>
+          <w:bCs/>
+          <w:color w:val="3D97B6" w:themeColor="accent2"/>
+          <w:spacing w:val="1"/>
+          <w:sz w:val="24"/>
+        </w:rPr>
+      </w:pPr>
+    </w:p>
+    <w:p>
+      <w:pPr>
+        <w:pStyle w:val="ListParagraph"/>
+        <w:tabs>
+          <w:tab w:val="left" w:pos="1680"/>
+        </w:tabs>
+        <w:spacing w:line="276" w:lineRule="auto"/>
+        <w:ind w:left="0"/>
+        <w:rPr>
+          <w:lang w:val="en-NZ"/>
+        </w:rPr>
+      </w:pPr>
+      <w:r>
+        <w:rPr>
+          <w:lang w:val="en-NZ"/>
+        </w:rPr>
+        <w:t xml:space="preserve">The </w:t>
+      </w:r>
+      <w:r>
+        <w:rPr>
+          <w:b/>
+          <w:bCs/>
+          <w:lang w:val="en-NZ"/>
+        </w:rPr>
+        <w:t>Country Explorer</w:t>
+      </w:r>
+      <w:r>
+        <w:rPr>
+          <w:lang w:val="en-NZ"/>
+        </w:rPr>
+        <w:t xml:space="preserve"> mobile platform has passed all verification benchmarks outlined in the technical specification.</w:t>
+      </w:r>
+      <w:r>
+        <w:rPr>
+          <w:lang w:val="en-NZ"/>
+        </w:rPr>
+        <w:t xml:space="preserve"> </w:t>
+      </w:r>
+      <w:r>
+        <w:rPr>
+          <w:lang w:val="en-NZ"/>
+        </w:rPr>
+        <w:t xml:space="preserve">Core feature sets—including remote data retrieval, </w:t>
+      </w:r>
+      <w:proofErr w:type="spellStart"/>
+      <w:r>
+        <w:rPr>
+          <w:lang w:val="en-NZ"/>
+        </w:rPr>
+        <w:t>CollectionView</w:t>
+      </w:r>
+      <w:proofErr w:type="spellEnd"/>
+      <w:r>
+        <w:rPr>
+          <w:lang w:val="en-NZ"/>
+        </w:rPr>
+        <w:t xml:space="preserve"> data binding, dynamic search, multi-region filtering, dual-criteria sorting, local </w:t>
+      </w:r>
+      <w:r>
+        <w:rPr>
+          <w:lang w:val="en-NZ"/>
+        </w:rPr>
+        <w:t>favourites</w:t>
+      </w:r>
+      <w:r>
+        <w:rPr>
+          <w:lang w:val="en-NZ"/>
+        </w:rPr>
+        <w:t xml:space="preserve"> persistence, and native device API integrations—have been validated across target execution environments. </w:t>
+      </w:r>
+    </w:p>
+    <w:p>
+      <w:pPr>
+        <w:pStyle w:val="ListParagraph"/>
+        <w:tabs>
+          <w:tab w:val="left" w:pos="1680"/>
+        </w:tabs>
+        <w:spacing w:line="276" w:lineRule="auto"/>
+        <w:ind w:left="0"/>
+        <w:rPr>
+          <w:lang w:val="en-NZ"/>
+        </w:rPr>
+      </w:pPr>
+      <w:r>
+        <w:rPr>
+          <w:lang w:val="en-NZ"/>
+        </w:rPr>
+        <w:t xml:space="preserve">All application source code, technical documentation, issue resolution tracking logs, and automated test plans are version-controlled and synchronized within the central repository. </w:t>
+      </w:r>
+    </w:p>
+    <w:p>
+      <w:pPr>
+        <w:pStyle w:val="ListParagraph"/>
+        <w:tabs>
+          <w:tab w:val="left" w:pos="1680"/>
+        </w:tabs>
+        <w:spacing w:line="276" w:lineRule="auto"/>
+        <w:ind w:left="0"/>
+        <w:rPr>
+          <w:rFonts w:cs="Times New Roman (Body CS)"/>
+          <w:b/>
+          <w:bCs/>
+          <w:color w:val="3D97B6" w:themeColor="accent2"/>
+          <w:spacing w:val="1"/>
+          <w:sz w:val="24"/>
+        </w:rPr>
+      </w:pPr>
+    </w:p>
+    <w:p>
+      <w:pPr>
+        <w:pStyle w:val="ListParagraph"/>
+        <w:tabs>
+          <w:tab w:val="left" w:pos="1680"/>
+        </w:tabs>
+        <w:spacing w:line="276" w:lineRule="auto"/>
+        <w:ind w:left="0"/>
+        <w:rPr>
+          <w:rFonts w:cs="Times New Roman (Body CS)"/>
+          <w:b/>
+          <w:bCs/>
+          <w:color w:val="3D97B6" w:themeColor="accent2"/>
+          <w:spacing w:val="1"/>
+          <w:sz w:val="24"/>
+        </w:rPr>
+      </w:pPr>
+      <w:r>
+        <w:rPr>
+          <w:rFonts w:cs="Times New Roman (Body CS)"/>
+          <w:b/>
+          <w:bCs/>
+          <w:color w:val="3D97B6" w:themeColor="accent2"/>
+          <w:spacing w:val="1"/>
+          <w:sz w:val="24"/>
+        </w:rPr>
+        <w:t>Document Approval &amp; Verification</w:t>
+      </w:r>
+    </w:p>
+    <w:p>
+      <w:pPr>
+        <w:tabs>
+          <w:tab w:val="left" w:pos="1680"/>
+        </w:tabs>
+        <w:spacing w:after="0" w:line="360" w:lineRule="auto"/>
+      </w:pPr>
+      <w:r>
+        <w:rPr>
+          <w:b/>
+          <w:bCs/>
+        </w:rPr>
+        <w:t>Project Lead / Developer:</w:t>
+      </w:r>
+      <w:r>
+        <w:t xml:space="preserve"> S</w:t>
+      </w:r>
+      <w:r>
+        <w:t>eanoa Ilaoa</w:t>
+      </w:r>
+    </w:p>
+    <w:p>
+      <w:pPr>
+        <w:tabs>
+          <w:tab w:val="left" w:pos="1680"/>
+        </w:tabs>
+        <w:spacing w:after="0" w:line="360" w:lineRule="auto"/>
+      </w:pPr>
+      <w:r>
+        <w:rPr>
+          <w:b/>
+          <w:bCs/>
+        </w:rPr>
+        <w:t>Build Status:</w:t>
+      </w:r>
+      <w:r>
+        <w:t xml:space="preserve"> PASSED (0 Errors, 0 Warnings)</w:t>
+      </w:r>
+    </w:p>
+    <w:p>
+      <w:pPr>
+        <w:tabs>
+          <w:tab w:val="left" w:pos="1680"/>
+        </w:tabs>
+        <w:spacing w:after="0" w:line="360" w:lineRule="auto"/>
+      </w:pPr>
+      <w:r>
+        <w:rPr>
+          <w:b/>
+          <w:bCs/>
+        </w:rPr>
+        <w:t>Repository Remote</w:t>
+      </w:r>
+      <w:r>
+        <w:t xml:space="preserve">: </w:t>
+      </w:r>
+      <w:hyperlink r:id="rId12" w:history="1">
+        <w:r>
+          <w:rPr>
+            <w:rStyle w:val="Hyperlink"/>
+          </w:rPr>
+          <w:t>https://github.com/si8168/CountryExplorer.git</w:t>
+        </w:r>
+      </w:hyperlink>
+    </w:p>
+    <w:p>
+      <w:pPr>
+        <w:tabs>
+          <w:tab w:val="left" w:pos="1680"/>
+        </w:tabs>
+        <w:spacing w:after="0" w:line="360" w:lineRule="auto"/>
+      </w:pPr>
+      <w:r>
+        <w:rPr>
+          <w:b/>
+          <w:bCs/>
+        </w:rPr>
+        <w:t>Target Framework:</w:t>
+      </w:r>
+      <w:r>
+        <w:t xml:space="preserve"> .NET 9.0 MAUI</w:t>
+      </w:r>
+    </w:p>
+    <w:p>
+      <w:pPr>
+        <w:tabs>
+          <w:tab w:val="left" w:pos="1680"/>
+        </w:tabs>
+        <w:spacing w:after="0" w:line="360" w:lineRule="auto"/>
+      </w:pPr>
+      <w:r>
+        <w:rPr>
+          <w:b/>
+          <w:bCs/>
+        </w:rPr>
+        <w:t>Document Revision:</w:t>
+      </w:r>
+      <w:r>
+        <w:t xml:space="preserve"> 1.0.0 (Final Release)</w:t>
+      </w:r>
+    </w:p>
+    <w:p>
+      <w:pPr>
+        <w:tabs>
+          <w:tab w:val="left" w:pos="1680"/>
+        </w:tabs>
+        <w:spacing w:after="0" w:line="360" w:lineRule="auto"/>
+      </w:pPr>
+      <w:r>
+        <w:rPr>
+          <w:b/>
+          <w:bCs/>
+        </w:rPr>
+        <w:t>Date of Approval</w:t>
+      </w:r>
+      <w:r>
+        <w:t>: August 26, 2026</w:t>
+      </w:r>
+    </w:p>
+    <w:p>
+      <w:pPr>
+        <w:tabs>
+          <w:tab w:val="left" w:pos="1680"/>
+        </w:tabs>
+        <w:spacing w:after="0" w:line="360" w:lineRule="auto"/>
+      </w:pPr>
+    </w:p>
+    <w:p>
+      <w:pPr>
+        <w:tabs>
+          <w:tab w:val="left" w:pos="1680"/>
+        </w:tabs>
+        <w:spacing w:after="0" w:line="360" w:lineRule="auto"/>
+      </w:pPr>
+    </w:p>
+    <w:p>
+      <w:pPr>
+        <w:tabs>
+          <w:tab w:val="left" w:pos="1680"/>
+        </w:tabs>
+        <w:spacing w:after="0" w:line="360" w:lineRule="auto"/>
+        <w:jc w:val="center"/>
+        <w:rPr>
+          <w:i/>
+          <w:iCs/>
+        </w:rPr>
+      </w:pPr>
+      <w:r>
+        <w:rPr>
+          <w:i/>
+          <w:iCs/>
+        </w:rPr>
+        <w:t>( END OF DOCUMENT )</w:t>
+      </w:r>
+    </w:p>
     <w:sectPr>
-      <w:footerReference w:type="default" r:id="rId12"/>
+      <w:footerReference w:type="default" r:id="rId13"/>
       <w:pgSz w:w="12240" w:h="15840" w:code="1"/>
       <w:pgMar w:top="1440" w:right="1440" w:bottom="720" w:left="1440" w:header="720" w:footer="288" w:gutter="0"/>
       <w:cols w:space="720"/>
@@ -1140,6 +3208,120 @@
     </w:lvl>
   </w:abstractNum>
   <w:abstractNum w:abstractNumId="12" w15:restartNumberingAfterBreak="0">
+    <w:nsid w:val="062F5ADC"/>
+    <w:multiLevelType w:val="hybridMultilevel"/>
+    <w:tmpl w:val="B2C24360"/>
+    <w:lvl w:ilvl="0" w:tplc="14090001">
+      <w:start w:val="1"/>
+      <w:numFmt w:val="bullet"/>
+      <w:lvlText w:val=""/>
+      <w:lvlJc w:val="left"/>
+      <w:pPr>
+        <w:ind w:left="360" w:hanging="360"/>
+      </w:pPr>
+      <w:rPr>
+        <w:rFonts w:ascii="Symbol" w:hAnsi="Symbol" w:hint="default"/>
+        <w:i w:val="0"/>
+      </w:rPr>
+    </w:lvl>
+    <w:lvl w:ilvl="1" w:tplc="FFFFFFFF">
+      <w:start w:val="1"/>
+      <w:numFmt w:val="bullet"/>
+      <w:lvlText w:val="o"/>
+      <w:lvlJc w:val="left"/>
+      <w:pPr>
+        <w:ind w:left="1080" w:hanging="360"/>
+      </w:pPr>
+      <w:rPr>
+        <w:rFonts w:ascii="Courier New" w:hAnsi="Courier New" w:cs="Courier New" w:hint="default"/>
+      </w:rPr>
+    </w:lvl>
+    <w:lvl w:ilvl="2" w:tplc="FFFFFFFF">
+      <w:start w:val="1"/>
+      <w:numFmt w:val="bullet"/>
+      <w:lvlText w:val=""/>
+      <w:lvlJc w:val="left"/>
+      <w:pPr>
+        <w:ind w:left="1800" w:hanging="360"/>
+      </w:pPr>
+      <w:rPr>
+        <w:rFonts w:ascii="Wingdings" w:hAnsi="Wingdings" w:hint="default"/>
+      </w:rPr>
+    </w:lvl>
+    <w:lvl w:ilvl="3" w:tplc="FFFFFFFF" w:tentative="1">
+      <w:start w:val="1"/>
+      <w:numFmt w:val="bullet"/>
+      <w:lvlText w:val=""/>
+      <w:lvlJc w:val="left"/>
+      <w:pPr>
+        <w:ind w:left="2520" w:hanging="360"/>
+      </w:pPr>
+      <w:rPr>
+        <w:rFonts w:ascii="Symbol" w:hAnsi="Symbol" w:hint="default"/>
+      </w:rPr>
+    </w:lvl>
+    <w:lvl w:ilvl="4" w:tplc="FFFFFFFF" w:tentative="1">
+      <w:start w:val="1"/>
+      <w:numFmt w:val="bullet"/>
+      <w:lvlText w:val="o"/>
+      <w:lvlJc w:val="left"/>
+      <w:pPr>
+        <w:ind w:left="3240" w:hanging="360"/>
+      </w:pPr>
+      <w:rPr>
+        <w:rFonts w:ascii="Courier New" w:hAnsi="Courier New" w:cs="Courier New" w:hint="default"/>
+      </w:rPr>
+    </w:lvl>
+    <w:lvl w:ilvl="5" w:tplc="FFFFFFFF" w:tentative="1">
+      <w:start w:val="1"/>
+      <w:numFmt w:val="bullet"/>
+      <w:lvlText w:val=""/>
+      <w:lvlJc w:val="left"/>
+      <w:pPr>
+        <w:ind w:left="3960" w:hanging="360"/>
+      </w:pPr>
+      <w:rPr>
+        <w:rFonts w:ascii="Wingdings" w:hAnsi="Wingdings" w:hint="default"/>
+      </w:rPr>
+    </w:lvl>
+    <w:lvl w:ilvl="6" w:tplc="FFFFFFFF" w:tentative="1">
+      <w:start w:val="1"/>
+      <w:numFmt w:val="bullet"/>
+      <w:lvlText w:val=""/>
+      <w:lvlJc w:val="left"/>
+      <w:pPr>
+        <w:ind w:left="4680" w:hanging="360"/>
+      </w:pPr>
+      <w:rPr>
+        <w:rFonts w:ascii="Symbol" w:hAnsi="Symbol" w:hint="default"/>
+      </w:rPr>
+    </w:lvl>
+    <w:lvl w:ilvl="7" w:tplc="FFFFFFFF" w:tentative="1">
+      <w:start w:val="1"/>
+      <w:numFmt w:val="bullet"/>
+      <w:lvlText w:val="o"/>
+      <w:lvlJc w:val="left"/>
+      <w:pPr>
+        <w:ind w:left="5400" w:hanging="360"/>
+      </w:pPr>
+      <w:rPr>
+        <w:rFonts w:ascii="Courier New" w:hAnsi="Courier New" w:cs="Courier New" w:hint="default"/>
+      </w:rPr>
+    </w:lvl>
+    <w:lvl w:ilvl="8" w:tplc="FFFFFFFF" w:tentative="1">
+      <w:start w:val="1"/>
+      <w:numFmt w:val="bullet"/>
+      <w:lvlText w:val=""/>
+      <w:lvlJc w:val="left"/>
+      <w:pPr>
+        <w:ind w:left="6120" w:hanging="360"/>
+      </w:pPr>
+      <w:rPr>
+        <w:rFonts w:ascii="Wingdings" w:hAnsi="Wingdings" w:hint="default"/>
+      </w:rPr>
+    </w:lvl>
+  </w:abstractNum>
+  <w:abstractNum w:abstractNumId="13" w15:restartNumberingAfterBreak="0">
     <w:nsid w:val="0C7D37C1"/>
     <w:multiLevelType w:val="multilevel"/>
     <w:tmpl w:val="6340115C"/>
@@ -1288,7 +3470,120 @@
       </w:rPr>
     </w:lvl>
   </w:abstractNum>
-  <w:abstractNum w:abstractNumId="13" w15:restartNumberingAfterBreak="0">
+  <w:abstractNum w:abstractNumId="14" w15:restartNumberingAfterBreak="0">
+    <w:nsid w:val="179431C9"/>
+    <w:multiLevelType w:val="multilevel"/>
+    <w:tmpl w:val="5CBADCA2"/>
+    <w:lvl w:ilvl="0">
+      <w:start w:val="1"/>
+      <w:numFmt w:val="decimal"/>
+      <w:lvlText w:val="%1."/>
+      <w:lvlJc w:val="left"/>
+      <w:pPr>
+        <w:tabs>
+          <w:tab w:val="num" w:pos="720"/>
+        </w:tabs>
+        <w:ind w:left="720" w:hanging="360"/>
+      </w:pPr>
+    </w:lvl>
+    <w:lvl w:ilvl="1" w:tentative="1">
+      <w:start w:val="1"/>
+      <w:numFmt w:val="decimal"/>
+      <w:lvlText w:val="%2."/>
+      <w:lvlJc w:val="left"/>
+      <w:pPr>
+        <w:tabs>
+          <w:tab w:val="num" w:pos="1440"/>
+        </w:tabs>
+        <w:ind w:left="1440" w:hanging="360"/>
+      </w:pPr>
+    </w:lvl>
+    <w:lvl w:ilvl="2" w:tentative="1">
+      <w:start w:val="1"/>
+      <w:numFmt w:val="decimal"/>
+      <w:lvlText w:val="%3."/>
+      <w:lvlJc w:val="left"/>
+      <w:pPr>
+        <w:tabs>
+          <w:tab w:val="num" w:pos="2160"/>
+        </w:tabs>
+        <w:ind w:left="2160" w:hanging="360"/>
+      </w:pPr>
+    </w:lvl>
+    <w:lvl w:ilvl="3" w:tentative="1">
+      <w:start w:val="1"/>
+      <w:numFmt w:val="decimal"/>
+      <w:lvlText w:val="%4."/>
+      <w:lvlJc w:val="left"/>
+      <w:pPr>
+        <w:tabs>
+          <w:tab w:val="num" w:pos="2880"/>
+        </w:tabs>
+        <w:ind w:left="2880" w:hanging="360"/>
+      </w:pPr>
+    </w:lvl>
+    <w:lvl w:ilvl="4" w:tentative="1">
+      <w:start w:val="1"/>
+      <w:numFmt w:val="decimal"/>
+      <w:lvlText w:val="%5."/>
+      <w:lvlJc w:val="left"/>
+      <w:pPr>
+        <w:tabs>
+          <w:tab w:val="num" w:pos="3600"/>
+        </w:tabs>
+        <w:ind w:left="3600" w:hanging="360"/>
+      </w:pPr>
+    </w:lvl>
+    <w:lvl w:ilvl="5" w:tentative="1">
+      <w:start w:val="1"/>
+      <w:numFmt w:val="decimal"/>
+      <w:lvlText w:val="%6."/>
+      <w:lvlJc w:val="left"/>
+      <w:pPr>
+        <w:tabs>
+          <w:tab w:val="num" w:pos="4320"/>
+        </w:tabs>
+        <w:ind w:left="4320" w:hanging="360"/>
+      </w:pPr>
+    </w:lvl>
+    <w:lvl w:ilvl="6" w:tentative="1">
+      <w:start w:val="1"/>
+      <w:numFmt w:val="decimal"/>
+      <w:lvlText w:val="%7."/>
+      <w:lvlJc w:val="left"/>
+      <w:pPr>
+        <w:tabs>
+          <w:tab w:val="num" w:pos="5040"/>
+        </w:tabs>
+        <w:ind w:left="5040" w:hanging="360"/>
+      </w:pPr>
+    </w:lvl>
+    <w:lvl w:ilvl="7" w:tentative="1">
+      <w:start w:val="1"/>
+      <w:numFmt w:val="decimal"/>
+      <w:lvlText w:val="%8."/>
+      <w:lvlJc w:val="left"/>
+      <w:pPr>
+        <w:tabs>
+          <w:tab w:val="num" w:pos="5760"/>
+        </w:tabs>
+        <w:ind w:left="5760" w:hanging="360"/>
+      </w:pPr>
+    </w:lvl>
+    <w:lvl w:ilvl="8" w:tentative="1">
+      <w:start w:val="1"/>
+      <w:numFmt w:val="decimal"/>
+      <w:lvlText w:val="%9."/>
+      <w:lvlJc w:val="left"/>
+      <w:pPr>
+        <w:tabs>
+          <w:tab w:val="num" w:pos="6480"/>
+        </w:tabs>
+        <w:ind w:left="6480" w:hanging="360"/>
+      </w:pPr>
+    </w:lvl>
+  </w:abstractNum>
+  <w:abstractNum w:abstractNumId="15" w15:restartNumberingAfterBreak="0">
     <w:nsid w:val="1CBA303E"/>
     <w:multiLevelType w:val="hybridMultilevel"/>
     <w:tmpl w:val="0CF2F592"/>
@@ -1402,7 +3697,394 @@
       </w:rPr>
     </w:lvl>
   </w:abstractNum>
-  <w:abstractNum w:abstractNumId="14" w15:restartNumberingAfterBreak="0">
+  <w:abstractNum w:abstractNumId="16" w15:restartNumberingAfterBreak="0">
+    <w:nsid w:val="24A21ECE"/>
+    <w:multiLevelType w:val="multilevel"/>
+    <w:tmpl w:val="19287FBA"/>
+    <w:lvl w:ilvl="0">
+      <w:start w:val="1"/>
+      <w:numFmt w:val="bullet"/>
+      <w:lvlText w:val=""/>
+      <w:lvlJc w:val="left"/>
+      <w:pPr>
+        <w:tabs>
+          <w:tab w:val="num" w:pos="720"/>
+        </w:tabs>
+        <w:ind w:left="720" w:hanging="360"/>
+      </w:pPr>
+      <w:rPr>
+        <w:rFonts w:ascii="Symbol" w:hAnsi="Symbol" w:hint="default"/>
+        <w:sz w:val="20"/>
+      </w:rPr>
+    </w:lvl>
+    <w:lvl w:ilvl="1" w:tentative="1">
+      <w:start w:val="1"/>
+      <w:numFmt w:val="bullet"/>
+      <w:lvlText w:val="o"/>
+      <w:lvlJc w:val="left"/>
+      <w:pPr>
+        <w:tabs>
+          <w:tab w:val="num" w:pos="1440"/>
+        </w:tabs>
+        <w:ind w:left="1440" w:hanging="360"/>
+      </w:pPr>
+      <w:rPr>
+        <w:rFonts w:ascii="Courier New" w:hAnsi="Courier New" w:hint="default"/>
+        <w:sz w:val="20"/>
+      </w:rPr>
+    </w:lvl>
+    <w:lvl w:ilvl="2" w:tentative="1">
+      <w:start w:val="1"/>
+      <w:numFmt w:val="bullet"/>
+      <w:lvlText w:val=""/>
+      <w:lvlJc w:val="left"/>
+      <w:pPr>
+        <w:tabs>
+          <w:tab w:val="num" w:pos="2160"/>
+        </w:tabs>
+        <w:ind w:left="2160" w:hanging="360"/>
+      </w:pPr>
+      <w:rPr>
+        <w:rFonts w:ascii="Wingdings" w:hAnsi="Wingdings" w:hint="default"/>
+        <w:sz w:val="20"/>
+      </w:rPr>
+    </w:lvl>
+    <w:lvl w:ilvl="3" w:tentative="1">
+      <w:start w:val="1"/>
+      <w:numFmt w:val="bullet"/>
+      <w:lvlText w:val=""/>
+      <w:lvlJc w:val="left"/>
+      <w:pPr>
+        <w:tabs>
+          <w:tab w:val="num" w:pos="2880"/>
+        </w:tabs>
+        <w:ind w:left="2880" w:hanging="360"/>
+      </w:pPr>
+      <w:rPr>
+        <w:rFonts w:ascii="Wingdings" w:hAnsi="Wingdings" w:hint="default"/>
+        <w:sz w:val="20"/>
+      </w:rPr>
+    </w:lvl>
+    <w:lvl w:ilvl="4" w:tentative="1">
+      <w:start w:val="1"/>
+      <w:numFmt w:val="bullet"/>
+      <w:lvlText w:val=""/>
+      <w:lvlJc w:val="left"/>
+      <w:pPr>
+        <w:tabs>
+          <w:tab w:val="num" w:pos="3600"/>
+        </w:tabs>
+        <w:ind w:left="3600" w:hanging="360"/>
+      </w:pPr>
+      <w:rPr>
+        <w:rFonts w:ascii="Wingdings" w:hAnsi="Wingdings" w:hint="default"/>
+        <w:sz w:val="20"/>
+      </w:rPr>
+    </w:lvl>
+    <w:lvl w:ilvl="5" w:tentative="1">
+      <w:start w:val="1"/>
+      <w:numFmt w:val="bullet"/>
+      <w:lvlText w:val=""/>
+      <w:lvlJc w:val="left"/>
+      <w:pPr>
+        <w:tabs>
+          <w:tab w:val="num" w:pos="4320"/>
+        </w:tabs>
+        <w:ind w:left="4320" w:hanging="360"/>
+      </w:pPr>
+      <w:rPr>
+        <w:rFonts w:ascii="Wingdings" w:hAnsi="Wingdings" w:hint="default"/>
+        <w:sz w:val="20"/>
+      </w:rPr>
+    </w:lvl>
+    <w:lvl w:ilvl="6" w:tentative="1">
+      <w:start w:val="1"/>
+      <w:numFmt w:val="bullet"/>
+      <w:lvlText w:val=""/>
+      <w:lvlJc w:val="left"/>
+      <w:pPr>
+        <w:tabs>
+          <w:tab w:val="num" w:pos="5040"/>
+        </w:tabs>
+        <w:ind w:left="5040" w:hanging="360"/>
+      </w:pPr>
+      <w:rPr>
+        <w:rFonts w:ascii="Wingdings" w:hAnsi="Wingdings" w:hint="default"/>
+        <w:sz w:val="20"/>
+      </w:rPr>
+    </w:lvl>
+    <w:lvl w:ilvl="7" w:tentative="1">
+      <w:start w:val="1"/>
+      <w:numFmt w:val="bullet"/>
+      <w:lvlText w:val=""/>
+      <w:lvlJc w:val="left"/>
+      <w:pPr>
+        <w:tabs>
+          <w:tab w:val="num" w:pos="5760"/>
+        </w:tabs>
+        <w:ind w:left="5760" w:hanging="360"/>
+      </w:pPr>
+      <w:rPr>
+        <w:rFonts w:ascii="Wingdings" w:hAnsi="Wingdings" w:hint="default"/>
+        <w:sz w:val="20"/>
+      </w:rPr>
+    </w:lvl>
+    <w:lvl w:ilvl="8" w:tentative="1">
+      <w:start w:val="1"/>
+      <w:numFmt w:val="bullet"/>
+      <w:lvlText w:val=""/>
+      <w:lvlJc w:val="left"/>
+      <w:pPr>
+        <w:tabs>
+          <w:tab w:val="num" w:pos="6480"/>
+        </w:tabs>
+        <w:ind w:left="6480" w:hanging="360"/>
+      </w:pPr>
+      <w:rPr>
+        <w:rFonts w:ascii="Wingdings" w:hAnsi="Wingdings" w:hint="default"/>
+        <w:sz w:val="20"/>
+      </w:rPr>
+    </w:lvl>
+  </w:abstractNum>
+  <w:abstractNum w:abstractNumId="17" w15:restartNumberingAfterBreak="0">
+    <w:nsid w:val="30DF1AF2"/>
+    <w:multiLevelType w:val="hybridMultilevel"/>
+    <w:tmpl w:val="581813BA"/>
+    <w:lvl w:ilvl="0" w:tplc="1409000F">
+      <w:start w:val="1"/>
+      <w:numFmt w:val="decimal"/>
+      <w:lvlText w:val="%1."/>
+      <w:lvlJc w:val="left"/>
+      <w:pPr>
+        <w:ind w:left="720" w:hanging="360"/>
+      </w:pPr>
+      <w:rPr>
+        <w:rFonts w:hint="default"/>
+      </w:rPr>
+    </w:lvl>
+    <w:lvl w:ilvl="1" w:tplc="14090019" w:tentative="1">
+      <w:start w:val="1"/>
+      <w:numFmt w:val="lowerLetter"/>
+      <w:lvlText w:val="%2."/>
+      <w:lvlJc w:val="left"/>
+      <w:pPr>
+        <w:ind w:left="1440" w:hanging="360"/>
+      </w:pPr>
+    </w:lvl>
+    <w:lvl w:ilvl="2" w:tplc="1409001B" w:tentative="1">
+      <w:start w:val="1"/>
+      <w:numFmt w:val="lowerRoman"/>
+      <w:lvlText w:val="%3."/>
+      <w:lvlJc w:val="right"/>
+      <w:pPr>
+        <w:ind w:left="2160" w:hanging="180"/>
+      </w:pPr>
+    </w:lvl>
+    <w:lvl w:ilvl="3" w:tplc="1409000F" w:tentative="1">
+      <w:start w:val="1"/>
+      <w:numFmt w:val="decimal"/>
+      <w:lvlText w:val="%4."/>
+      <w:lvlJc w:val="left"/>
+      <w:pPr>
+        <w:ind w:left="2880" w:hanging="360"/>
+      </w:pPr>
+    </w:lvl>
+    <w:lvl w:ilvl="4" w:tplc="14090019" w:tentative="1">
+      <w:start w:val="1"/>
+      <w:numFmt w:val="lowerLetter"/>
+      <w:lvlText w:val="%5."/>
+      <w:lvlJc w:val="left"/>
+      <w:pPr>
+        <w:ind w:left="3600" w:hanging="360"/>
+      </w:pPr>
+    </w:lvl>
+    <w:lvl w:ilvl="5" w:tplc="1409001B" w:tentative="1">
+      <w:start w:val="1"/>
+      <w:numFmt w:val="lowerRoman"/>
+      <w:lvlText w:val="%6."/>
+      <w:lvlJc w:val="right"/>
+      <w:pPr>
+        <w:ind w:left="4320" w:hanging="180"/>
+      </w:pPr>
+    </w:lvl>
+    <w:lvl w:ilvl="6" w:tplc="1409000F" w:tentative="1">
+      <w:start w:val="1"/>
+      <w:numFmt w:val="decimal"/>
+      <w:lvlText w:val="%7."/>
+      <w:lvlJc w:val="left"/>
+      <w:pPr>
+        <w:ind w:left="5040" w:hanging="360"/>
+      </w:pPr>
+    </w:lvl>
+    <w:lvl w:ilvl="7" w:tplc="14090019" w:tentative="1">
+      <w:start w:val="1"/>
+      <w:numFmt w:val="lowerLetter"/>
+      <w:lvlText w:val="%8."/>
+      <w:lvlJc w:val="left"/>
+      <w:pPr>
+        <w:ind w:left="5760" w:hanging="360"/>
+      </w:pPr>
+    </w:lvl>
+    <w:lvl w:ilvl="8" w:tplc="1409001B" w:tentative="1">
+      <w:start w:val="1"/>
+      <w:numFmt w:val="lowerRoman"/>
+      <w:lvlText w:val="%9."/>
+      <w:lvlJc w:val="right"/>
+      <w:pPr>
+        <w:ind w:left="6480" w:hanging="180"/>
+      </w:pPr>
+    </w:lvl>
+  </w:abstractNum>
+  <w:abstractNum w:abstractNumId="18" w15:restartNumberingAfterBreak="0">
+    <w:nsid w:val="4E1826C3"/>
+    <w:multiLevelType w:val="multilevel"/>
+    <w:tmpl w:val="72B02420"/>
+    <w:lvl w:ilvl="0">
+      <w:start w:val="1"/>
+      <w:numFmt w:val="bullet"/>
+      <w:lvlText w:val=""/>
+      <w:lvlJc w:val="left"/>
+      <w:pPr>
+        <w:tabs>
+          <w:tab w:val="num" w:pos="720"/>
+        </w:tabs>
+        <w:ind w:left="720" w:hanging="360"/>
+      </w:pPr>
+      <w:rPr>
+        <w:rFonts w:ascii="Symbol" w:hAnsi="Symbol" w:hint="default"/>
+        <w:sz w:val="20"/>
+      </w:rPr>
+    </w:lvl>
+    <w:lvl w:ilvl="1" w:tentative="1">
+      <w:start w:val="1"/>
+      <w:numFmt w:val="bullet"/>
+      <w:lvlText w:val="o"/>
+      <w:lvlJc w:val="left"/>
+      <w:pPr>
+        <w:tabs>
+          <w:tab w:val="num" w:pos="1440"/>
+        </w:tabs>
+        <w:ind w:left="1440" w:hanging="360"/>
+      </w:pPr>
+      <w:rPr>
+        <w:rFonts w:ascii="Courier New" w:hAnsi="Courier New" w:hint="default"/>
+        <w:sz w:val="20"/>
+      </w:rPr>
+    </w:lvl>
+    <w:lvl w:ilvl="2" w:tentative="1">
+      <w:start w:val="1"/>
+      <w:numFmt w:val="bullet"/>
+      <w:lvlText w:val=""/>
+      <w:lvlJc w:val="left"/>
+      <w:pPr>
+        <w:tabs>
+          <w:tab w:val="num" w:pos="2160"/>
+        </w:tabs>
+        <w:ind w:left="2160" w:hanging="360"/>
+      </w:pPr>
+      <w:rPr>
+        <w:rFonts w:ascii="Wingdings" w:hAnsi="Wingdings" w:hint="default"/>
+        <w:sz w:val="20"/>
+      </w:rPr>
+    </w:lvl>
+    <w:lvl w:ilvl="3" w:tentative="1">
+      <w:start w:val="1"/>
+      <w:numFmt w:val="bullet"/>
+      <w:lvlText w:val=""/>
+      <w:lvlJc w:val="left"/>
+      <w:pPr>
+        <w:tabs>
+          <w:tab w:val="num" w:pos="2880"/>
+        </w:tabs>
+        <w:ind w:left="2880" w:hanging="360"/>
+      </w:pPr>
+      <w:rPr>
+        <w:rFonts w:ascii="Wingdings" w:hAnsi="Wingdings" w:hint="default"/>
+        <w:sz w:val="20"/>
+      </w:rPr>
+    </w:lvl>
+    <w:lvl w:ilvl="4" w:tentative="1">
+      <w:start w:val="1"/>
+      <w:numFmt w:val="bullet"/>
+      <w:lvlText w:val=""/>
+      <w:lvlJc w:val="left"/>
+      <w:pPr>
+        <w:tabs>
+          <w:tab w:val="num" w:pos="3600"/>
+        </w:tabs>
+        <w:ind w:left="3600" w:hanging="360"/>
+      </w:pPr>
+      <w:rPr>
+        <w:rFonts w:ascii="Wingdings" w:hAnsi="Wingdings" w:hint="default"/>
+        <w:sz w:val="20"/>
+      </w:rPr>
+    </w:lvl>
+    <w:lvl w:ilvl="5" w:tentative="1">
+      <w:start w:val="1"/>
+      <w:numFmt w:val="bullet"/>
+      <w:lvlText w:val=""/>
+      <w:lvlJc w:val="left"/>
+      <w:pPr>
+        <w:tabs>
+          <w:tab w:val="num" w:pos="4320"/>
+        </w:tabs>
+        <w:ind w:left="4320" w:hanging="360"/>
+      </w:pPr>
+      <w:rPr>
+        <w:rFonts w:ascii="Wingdings" w:hAnsi="Wingdings" w:hint="default"/>
+        <w:sz w:val="20"/>
+      </w:rPr>
+    </w:lvl>
+    <w:lvl w:ilvl="6" w:tentative="1">
+      <w:start w:val="1"/>
+      <w:numFmt w:val="bullet"/>
+      <w:lvlText w:val=""/>
+      <w:lvlJc w:val="left"/>
+      <w:pPr>
+        <w:tabs>
+          <w:tab w:val="num" w:pos="5040"/>
+        </w:tabs>
+        <w:ind w:left="5040" w:hanging="360"/>
+      </w:pPr>
+      <w:rPr>
+        <w:rFonts w:ascii="Wingdings" w:hAnsi="Wingdings" w:hint="default"/>
+        <w:sz w:val="20"/>
+      </w:rPr>
+    </w:lvl>
+    <w:lvl w:ilvl="7" w:tentative="1">
+      <w:start w:val="1"/>
+      <w:numFmt w:val="bullet"/>
+      <w:lvlText w:val=""/>
+      <w:lvlJc w:val="left"/>
+      <w:pPr>
+        <w:tabs>
+          <w:tab w:val="num" w:pos="5760"/>
+        </w:tabs>
+        <w:ind w:left="5760" w:hanging="360"/>
+      </w:pPr>
+      <w:rPr>
+        <w:rFonts w:ascii="Wingdings" w:hAnsi="Wingdings" w:hint="default"/>
+        <w:sz w:val="20"/>
+      </w:rPr>
+    </w:lvl>
+    <w:lvl w:ilvl="8" w:tentative="1">
+      <w:start w:val="1"/>
+      <w:numFmt w:val="bullet"/>
+      <w:lvlText w:val=""/>
+      <w:lvlJc w:val="left"/>
+      <w:pPr>
+        <w:tabs>
+          <w:tab w:val="num" w:pos="6480"/>
+        </w:tabs>
+        <w:ind w:left="6480" w:hanging="360"/>
+      </w:pPr>
+      <w:rPr>
+        <w:rFonts w:ascii="Wingdings" w:hAnsi="Wingdings" w:hint="default"/>
+        <w:sz w:val="20"/>
+      </w:rPr>
+    </w:lvl>
+  </w:abstractNum>
+  <w:abstractNum w:abstractNumId="19" w15:restartNumberingAfterBreak="0">
     <w:nsid w:val="4EF66AE4"/>
     <w:multiLevelType w:val="hybridMultilevel"/>
     <w:tmpl w:val="6662439C"/>
@@ -1516,7 +4198,7 @@
       </w:rPr>
     </w:lvl>
   </w:abstractNum>
-  <w:abstractNum w:abstractNumId="15" w15:restartNumberingAfterBreak="0">
+  <w:abstractNum w:abstractNumId="20" w15:restartNumberingAfterBreak="0">
     <w:nsid w:val="4F787987"/>
     <w:multiLevelType w:val="multilevel"/>
     <w:tmpl w:val="DBDC0512"/>
@@ -1642,7 +4324,7 @@
       </w:rPr>
     </w:lvl>
   </w:abstractNum>
-  <w:abstractNum w:abstractNumId="16" w15:restartNumberingAfterBreak="0">
+  <w:abstractNum w:abstractNumId="21" w15:restartNumberingAfterBreak="0">
     <w:nsid w:val="565C3E0C"/>
     <w:multiLevelType w:val="hybridMultilevel"/>
     <w:tmpl w:val="4A540906"/>
@@ -1755,7 +4437,454 @@
       </w:rPr>
     </w:lvl>
   </w:abstractNum>
-  <w:abstractNum w:abstractNumId="17" w15:restartNumberingAfterBreak="0">
+  <w:abstractNum w:abstractNumId="22" w15:restartNumberingAfterBreak="0">
+    <w:nsid w:val="58E5033F"/>
+    <w:multiLevelType w:val="multilevel"/>
+    <w:tmpl w:val="94645612"/>
+    <w:lvl w:ilvl="0">
+      <w:start w:val="1"/>
+      <w:numFmt w:val="bullet"/>
+      <w:lvlText w:val=""/>
+      <w:lvlJc w:val="left"/>
+      <w:pPr>
+        <w:tabs>
+          <w:tab w:val="num" w:pos="720"/>
+        </w:tabs>
+        <w:ind w:left="720" w:hanging="360"/>
+      </w:pPr>
+      <w:rPr>
+        <w:rFonts w:ascii="Symbol" w:hAnsi="Symbol" w:hint="default"/>
+        <w:sz w:val="20"/>
+      </w:rPr>
+    </w:lvl>
+    <w:lvl w:ilvl="1" w:tentative="1">
+      <w:start w:val="1"/>
+      <w:numFmt w:val="bullet"/>
+      <w:lvlText w:val="o"/>
+      <w:lvlJc w:val="left"/>
+      <w:pPr>
+        <w:tabs>
+          <w:tab w:val="num" w:pos="1440"/>
+        </w:tabs>
+        <w:ind w:left="1440" w:hanging="360"/>
+      </w:pPr>
+      <w:rPr>
+        <w:rFonts w:ascii="Courier New" w:hAnsi="Courier New" w:hint="default"/>
+        <w:sz w:val="20"/>
+      </w:rPr>
+    </w:lvl>
+    <w:lvl w:ilvl="2" w:tentative="1">
+      <w:start w:val="1"/>
+      <w:numFmt w:val="bullet"/>
+      <w:lvlText w:val=""/>
+      <w:lvlJc w:val="left"/>
+      <w:pPr>
+        <w:tabs>
+          <w:tab w:val="num" w:pos="2160"/>
+        </w:tabs>
+        <w:ind w:left="2160" w:hanging="360"/>
+      </w:pPr>
+      <w:rPr>
+        <w:rFonts w:ascii="Wingdings" w:hAnsi="Wingdings" w:hint="default"/>
+        <w:sz w:val="20"/>
+      </w:rPr>
+    </w:lvl>
+    <w:lvl w:ilvl="3" w:tentative="1">
+      <w:start w:val="1"/>
+      <w:numFmt w:val="bullet"/>
+      <w:lvlText w:val=""/>
+      <w:lvlJc w:val="left"/>
+      <w:pPr>
+        <w:tabs>
+          <w:tab w:val="num" w:pos="2880"/>
+        </w:tabs>
+        <w:ind w:left="2880" w:hanging="360"/>
+      </w:pPr>
+      <w:rPr>
+        <w:rFonts w:ascii="Wingdings" w:hAnsi="Wingdings" w:hint="default"/>
+        <w:sz w:val="20"/>
+      </w:rPr>
+    </w:lvl>
+    <w:lvl w:ilvl="4" w:tentative="1">
+      <w:start w:val="1"/>
+      <w:numFmt w:val="bullet"/>
+      <w:lvlText w:val=""/>
+      <w:lvlJc w:val="left"/>
+      <w:pPr>
+        <w:tabs>
+          <w:tab w:val="num" w:pos="3600"/>
+        </w:tabs>
+        <w:ind w:left="3600" w:hanging="360"/>
+      </w:pPr>
+      <w:rPr>
+        <w:rFonts w:ascii="Wingdings" w:hAnsi="Wingdings" w:hint="default"/>
+        <w:sz w:val="20"/>
+      </w:rPr>
+    </w:lvl>
+    <w:lvl w:ilvl="5" w:tentative="1">
+      <w:start w:val="1"/>
+      <w:numFmt w:val="bullet"/>
+      <w:lvlText w:val=""/>
+      <w:lvlJc w:val="left"/>
+      <w:pPr>
+        <w:tabs>
+          <w:tab w:val="num" w:pos="4320"/>
+        </w:tabs>
+        <w:ind w:left="4320" w:hanging="360"/>
+      </w:pPr>
+      <w:rPr>
+        <w:rFonts w:ascii="Wingdings" w:hAnsi="Wingdings" w:hint="default"/>
+        <w:sz w:val="20"/>
+      </w:rPr>
+    </w:lvl>
+    <w:lvl w:ilvl="6" w:tentative="1">
+      <w:start w:val="1"/>
+      <w:numFmt w:val="bullet"/>
+      <w:lvlText w:val=""/>
+      <w:lvlJc w:val="left"/>
+      <w:pPr>
+        <w:tabs>
+          <w:tab w:val="num" w:pos="5040"/>
+        </w:tabs>
+        <w:ind w:left="5040" w:hanging="360"/>
+      </w:pPr>
+      <w:rPr>
+        <w:rFonts w:ascii="Wingdings" w:hAnsi="Wingdings" w:hint="default"/>
+        <w:sz w:val="20"/>
+      </w:rPr>
+    </w:lvl>
+    <w:lvl w:ilvl="7" w:tentative="1">
+      <w:start w:val="1"/>
+      <w:numFmt w:val="bullet"/>
+      <w:lvlText w:val=""/>
+      <w:lvlJc w:val="left"/>
+      <w:pPr>
+        <w:tabs>
+          <w:tab w:val="num" w:pos="5760"/>
+        </w:tabs>
+        <w:ind w:left="5760" w:hanging="360"/>
+      </w:pPr>
+      <w:rPr>
+        <w:rFonts w:ascii="Wingdings" w:hAnsi="Wingdings" w:hint="default"/>
+        <w:sz w:val="20"/>
+      </w:rPr>
+    </w:lvl>
+    <w:lvl w:ilvl="8" w:tentative="1">
+      <w:start w:val="1"/>
+      <w:numFmt w:val="bullet"/>
+      <w:lvlText w:val=""/>
+      <w:lvlJc w:val="left"/>
+      <w:pPr>
+        <w:tabs>
+          <w:tab w:val="num" w:pos="6480"/>
+        </w:tabs>
+        <w:ind w:left="6480" w:hanging="360"/>
+      </w:pPr>
+      <w:rPr>
+        <w:rFonts w:ascii="Wingdings" w:hAnsi="Wingdings" w:hint="default"/>
+        <w:sz w:val="20"/>
+      </w:rPr>
+    </w:lvl>
+  </w:abstractNum>
+  <w:abstractNum w:abstractNumId="23" w15:restartNumberingAfterBreak="0">
+    <w:nsid w:val="5B162381"/>
+    <w:multiLevelType w:val="multilevel"/>
+    <w:tmpl w:val="887A190E"/>
+    <w:lvl w:ilvl="0">
+      <w:start w:val="1"/>
+      <w:numFmt w:val="bullet"/>
+      <w:lvlText w:val=""/>
+      <w:lvlJc w:val="left"/>
+      <w:pPr>
+        <w:tabs>
+          <w:tab w:val="num" w:pos="720"/>
+        </w:tabs>
+        <w:ind w:left="720" w:hanging="360"/>
+      </w:pPr>
+      <w:rPr>
+        <w:rFonts w:ascii="Symbol" w:hAnsi="Symbol" w:hint="default"/>
+        <w:sz w:val="20"/>
+      </w:rPr>
+    </w:lvl>
+    <w:lvl w:ilvl="1" w:tentative="1">
+      <w:start w:val="1"/>
+      <w:numFmt w:val="bullet"/>
+      <w:lvlText w:val="o"/>
+      <w:lvlJc w:val="left"/>
+      <w:pPr>
+        <w:tabs>
+          <w:tab w:val="num" w:pos="1440"/>
+        </w:tabs>
+        <w:ind w:left="1440" w:hanging="360"/>
+      </w:pPr>
+      <w:rPr>
+        <w:rFonts w:ascii="Courier New" w:hAnsi="Courier New" w:hint="default"/>
+        <w:sz w:val="20"/>
+      </w:rPr>
+    </w:lvl>
+    <w:lvl w:ilvl="2" w:tentative="1">
+      <w:start w:val="1"/>
+      <w:numFmt w:val="bullet"/>
+      <w:lvlText w:val=""/>
+      <w:lvlJc w:val="left"/>
+      <w:pPr>
+        <w:tabs>
+          <w:tab w:val="num" w:pos="2160"/>
+        </w:tabs>
+        <w:ind w:left="2160" w:hanging="360"/>
+      </w:pPr>
+      <w:rPr>
+        <w:rFonts w:ascii="Wingdings" w:hAnsi="Wingdings" w:hint="default"/>
+        <w:sz w:val="20"/>
+      </w:rPr>
+    </w:lvl>
+    <w:lvl w:ilvl="3" w:tentative="1">
+      <w:start w:val="1"/>
+      <w:numFmt w:val="bullet"/>
+      <w:lvlText w:val=""/>
+      <w:lvlJc w:val="left"/>
+      <w:pPr>
+        <w:tabs>
+          <w:tab w:val="num" w:pos="2880"/>
+        </w:tabs>
+        <w:ind w:left="2880" w:hanging="360"/>
+      </w:pPr>
+      <w:rPr>
+        <w:rFonts w:ascii="Wingdings" w:hAnsi="Wingdings" w:hint="default"/>
+        <w:sz w:val="20"/>
+      </w:rPr>
+    </w:lvl>
+    <w:lvl w:ilvl="4" w:tentative="1">
+      <w:start w:val="1"/>
+      <w:numFmt w:val="bullet"/>
+      <w:lvlText w:val=""/>
+      <w:lvlJc w:val="left"/>
+      <w:pPr>
+        <w:tabs>
+          <w:tab w:val="num" w:pos="3600"/>
+        </w:tabs>
+        <w:ind w:left="3600" w:hanging="360"/>
+      </w:pPr>
+      <w:rPr>
+        <w:rFonts w:ascii="Wingdings" w:hAnsi="Wingdings" w:hint="default"/>
+        <w:sz w:val="20"/>
+      </w:rPr>
+    </w:lvl>
+    <w:lvl w:ilvl="5" w:tentative="1">
+      <w:start w:val="1"/>
+      <w:numFmt w:val="bullet"/>
+      <w:lvlText w:val=""/>
+      <w:lvlJc w:val="left"/>
+      <w:pPr>
+        <w:tabs>
+          <w:tab w:val="num" w:pos="4320"/>
+        </w:tabs>
+        <w:ind w:left="4320" w:hanging="360"/>
+      </w:pPr>
+      <w:rPr>
+        <w:rFonts w:ascii="Wingdings" w:hAnsi="Wingdings" w:hint="default"/>
+        <w:sz w:val="20"/>
+      </w:rPr>
+    </w:lvl>
+    <w:lvl w:ilvl="6" w:tentative="1">
+      <w:start w:val="1"/>
+      <w:numFmt w:val="bullet"/>
+      <w:lvlText w:val=""/>
+      <w:lvlJc w:val="left"/>
+      <w:pPr>
+        <w:tabs>
+          <w:tab w:val="num" w:pos="5040"/>
+        </w:tabs>
+        <w:ind w:left="5040" w:hanging="360"/>
+      </w:pPr>
+      <w:rPr>
+        <w:rFonts w:ascii="Wingdings" w:hAnsi="Wingdings" w:hint="default"/>
+        <w:sz w:val="20"/>
+      </w:rPr>
+    </w:lvl>
+    <w:lvl w:ilvl="7" w:tentative="1">
+      <w:start w:val="1"/>
+      <w:numFmt w:val="bullet"/>
+      <w:lvlText w:val=""/>
+      <w:lvlJc w:val="left"/>
+      <w:pPr>
+        <w:tabs>
+          <w:tab w:val="num" w:pos="5760"/>
+        </w:tabs>
+        <w:ind w:left="5760" w:hanging="360"/>
+      </w:pPr>
+      <w:rPr>
+        <w:rFonts w:ascii="Wingdings" w:hAnsi="Wingdings" w:hint="default"/>
+        <w:sz w:val="20"/>
+      </w:rPr>
+    </w:lvl>
+    <w:lvl w:ilvl="8" w:tentative="1">
+      <w:start w:val="1"/>
+      <w:numFmt w:val="bullet"/>
+      <w:lvlText w:val=""/>
+      <w:lvlJc w:val="left"/>
+      <w:pPr>
+        <w:tabs>
+          <w:tab w:val="num" w:pos="6480"/>
+        </w:tabs>
+        <w:ind w:left="6480" w:hanging="360"/>
+      </w:pPr>
+      <w:rPr>
+        <w:rFonts w:ascii="Wingdings" w:hAnsi="Wingdings" w:hint="default"/>
+        <w:sz w:val="20"/>
+      </w:rPr>
+    </w:lvl>
+  </w:abstractNum>
+  <w:abstractNum w:abstractNumId="24" w15:restartNumberingAfterBreak="0">
+    <w:nsid w:val="5E7611F6"/>
+    <w:multiLevelType w:val="multilevel"/>
+    <w:tmpl w:val="5DCCD542"/>
+    <w:lvl w:ilvl="0">
+      <w:start w:val="1"/>
+      <w:numFmt w:val="bullet"/>
+      <w:lvlText w:val=""/>
+      <w:lvlJc w:val="left"/>
+      <w:pPr>
+        <w:tabs>
+          <w:tab w:val="num" w:pos="720"/>
+        </w:tabs>
+        <w:ind w:left="720" w:hanging="360"/>
+      </w:pPr>
+      <w:rPr>
+        <w:rFonts w:ascii="Symbol" w:hAnsi="Symbol" w:hint="default"/>
+        <w:sz w:val="20"/>
+      </w:rPr>
+    </w:lvl>
+    <w:lvl w:ilvl="1" w:tentative="1">
+      <w:start w:val="1"/>
+      <w:numFmt w:val="bullet"/>
+      <w:lvlText w:val="o"/>
+      <w:lvlJc w:val="left"/>
+      <w:pPr>
+        <w:tabs>
+          <w:tab w:val="num" w:pos="1440"/>
+        </w:tabs>
+        <w:ind w:left="1440" w:hanging="360"/>
+      </w:pPr>
+      <w:rPr>
+        <w:rFonts w:ascii="Courier New" w:hAnsi="Courier New" w:hint="default"/>
+        <w:sz w:val="20"/>
+      </w:rPr>
+    </w:lvl>
+    <w:lvl w:ilvl="2" w:tentative="1">
+      <w:start w:val="1"/>
+      <w:numFmt w:val="bullet"/>
+      <w:lvlText w:val=""/>
+      <w:lvlJc w:val="left"/>
+      <w:pPr>
+        <w:tabs>
+          <w:tab w:val="num" w:pos="2160"/>
+        </w:tabs>
+        <w:ind w:left="2160" w:hanging="360"/>
+      </w:pPr>
+      <w:rPr>
+        <w:rFonts w:ascii="Wingdings" w:hAnsi="Wingdings" w:hint="default"/>
+        <w:sz w:val="20"/>
+      </w:rPr>
+    </w:lvl>
+    <w:lvl w:ilvl="3" w:tentative="1">
+      <w:start w:val="1"/>
+      <w:numFmt w:val="bullet"/>
+      <w:lvlText w:val=""/>
+      <w:lvlJc w:val="left"/>
+      <w:pPr>
+        <w:tabs>
+          <w:tab w:val="num" w:pos="2880"/>
+        </w:tabs>
+        <w:ind w:left="2880" w:hanging="360"/>
+      </w:pPr>
+      <w:rPr>
+        <w:rFonts w:ascii="Wingdings" w:hAnsi="Wingdings" w:hint="default"/>
+        <w:sz w:val="20"/>
+      </w:rPr>
+    </w:lvl>
+    <w:lvl w:ilvl="4" w:tentative="1">
+      <w:start w:val="1"/>
+      <w:numFmt w:val="bullet"/>
+      <w:lvlText w:val=""/>
+      <w:lvlJc w:val="left"/>
+      <w:pPr>
+        <w:tabs>
+          <w:tab w:val="num" w:pos="3600"/>
+        </w:tabs>
+        <w:ind w:left="3600" w:hanging="360"/>
+      </w:pPr>
+      <w:rPr>
+        <w:rFonts w:ascii="Wingdings" w:hAnsi="Wingdings" w:hint="default"/>
+        <w:sz w:val="20"/>
+      </w:rPr>
+    </w:lvl>
+    <w:lvl w:ilvl="5" w:tentative="1">
+      <w:start w:val="1"/>
+      <w:numFmt w:val="bullet"/>
+      <w:lvlText w:val=""/>
+      <w:lvlJc w:val="left"/>
+      <w:pPr>
+        <w:tabs>
+          <w:tab w:val="num" w:pos="4320"/>
+        </w:tabs>
+        <w:ind w:left="4320" w:hanging="360"/>
+      </w:pPr>
+      <w:rPr>
+        <w:rFonts w:ascii="Wingdings" w:hAnsi="Wingdings" w:hint="default"/>
+        <w:sz w:val="20"/>
+      </w:rPr>
+    </w:lvl>
+    <w:lvl w:ilvl="6" w:tentative="1">
+      <w:start w:val="1"/>
+      <w:numFmt w:val="bullet"/>
+      <w:lvlText w:val=""/>
+      <w:lvlJc w:val="left"/>
+      <w:pPr>
+        <w:tabs>
+          <w:tab w:val="num" w:pos="5040"/>
+        </w:tabs>
+        <w:ind w:left="5040" w:hanging="360"/>
+      </w:pPr>
+      <w:rPr>
+        <w:rFonts w:ascii="Wingdings" w:hAnsi="Wingdings" w:hint="default"/>
+        <w:sz w:val="20"/>
+      </w:rPr>
+    </w:lvl>
+    <w:lvl w:ilvl="7" w:tentative="1">
+      <w:start w:val="1"/>
+      <w:numFmt w:val="bullet"/>
+      <w:lvlText w:val=""/>
+      <w:lvlJc w:val="left"/>
+      <w:pPr>
+        <w:tabs>
+          <w:tab w:val="num" w:pos="5760"/>
+        </w:tabs>
+        <w:ind w:left="5760" w:hanging="360"/>
+      </w:pPr>
+      <w:rPr>
+        <w:rFonts w:ascii="Wingdings" w:hAnsi="Wingdings" w:hint="default"/>
+        <w:sz w:val="20"/>
+      </w:rPr>
+    </w:lvl>
+    <w:lvl w:ilvl="8" w:tentative="1">
+      <w:start w:val="1"/>
+      <w:numFmt w:val="bullet"/>
+      <w:lvlText w:val=""/>
+      <w:lvlJc w:val="left"/>
+      <w:pPr>
+        <w:tabs>
+          <w:tab w:val="num" w:pos="6480"/>
+        </w:tabs>
+        <w:ind w:left="6480" w:hanging="360"/>
+      </w:pPr>
+      <w:rPr>
+        <w:rFonts w:ascii="Wingdings" w:hAnsi="Wingdings" w:hint="default"/>
+        <w:sz w:val="20"/>
+      </w:rPr>
+    </w:lvl>
+  </w:abstractNum>
+  <w:abstractNum w:abstractNumId="25" w15:restartNumberingAfterBreak="0">
     <w:nsid w:val="657E5D71"/>
     <w:multiLevelType w:val="multilevel"/>
     <w:tmpl w:val="5F92E4C4"/>
@@ -1881,7 +5010,7 @@
       </w:rPr>
     </w:lvl>
   </w:abstractNum>
-  <w:abstractNum w:abstractNumId="18" w15:restartNumberingAfterBreak="0">
+  <w:abstractNum w:abstractNumId="26" w15:restartNumberingAfterBreak="0">
     <w:nsid w:val="74901467"/>
     <w:multiLevelType w:val="hybridMultilevel"/>
     <w:tmpl w:val="DB7EF44A"/>
@@ -1991,6 +5120,155 @@
       </w:pPr>
       <w:rPr>
         <w:rFonts w:ascii="Wingdings" w:hAnsi="Wingdings" w:hint="default"/>
+      </w:rPr>
+    </w:lvl>
+  </w:abstractNum>
+  <w:abstractNum w:abstractNumId="27" w15:restartNumberingAfterBreak="0">
+    <w:nsid w:val="7D9E5E73"/>
+    <w:multiLevelType w:val="multilevel"/>
+    <w:tmpl w:val="329E3CBC"/>
+    <w:lvl w:ilvl="0">
+      <w:start w:val="1"/>
+      <w:numFmt w:val="bullet"/>
+      <w:lvlText w:val=""/>
+      <w:lvlJc w:val="left"/>
+      <w:pPr>
+        <w:tabs>
+          <w:tab w:val="num" w:pos="720"/>
+        </w:tabs>
+        <w:ind w:left="720" w:hanging="360"/>
+      </w:pPr>
+      <w:rPr>
+        <w:rFonts w:ascii="Symbol" w:hAnsi="Symbol" w:hint="default"/>
+        <w:sz w:val="20"/>
+      </w:rPr>
+    </w:lvl>
+    <w:lvl w:ilvl="1" w:tentative="1">
+      <w:start w:val="1"/>
+      <w:numFmt w:val="bullet"/>
+      <w:lvlText w:val="o"/>
+      <w:lvlJc w:val="left"/>
+      <w:pPr>
+        <w:tabs>
+          <w:tab w:val="num" w:pos="1440"/>
+        </w:tabs>
+        <w:ind w:left="1440" w:hanging="360"/>
+      </w:pPr>
+      <w:rPr>
+        <w:rFonts w:ascii="Courier New" w:hAnsi="Courier New" w:hint="default"/>
+        <w:sz w:val="20"/>
+      </w:rPr>
+    </w:lvl>
+    <w:lvl w:ilvl="2" w:tentative="1">
+      <w:start w:val="1"/>
+      <w:numFmt w:val="bullet"/>
+      <w:lvlText w:val=""/>
+      <w:lvlJc w:val="left"/>
+      <w:pPr>
+        <w:tabs>
+          <w:tab w:val="num" w:pos="2160"/>
+        </w:tabs>
+        <w:ind w:left="2160" w:hanging="360"/>
+      </w:pPr>
+      <w:rPr>
+        <w:rFonts w:ascii="Wingdings" w:hAnsi="Wingdings" w:hint="default"/>
+        <w:sz w:val="20"/>
+      </w:rPr>
+    </w:lvl>
+    <w:lvl w:ilvl="3" w:tentative="1">
+      <w:start w:val="1"/>
+      <w:numFmt w:val="bullet"/>
+      <w:lvlText w:val=""/>
+      <w:lvlJc w:val="left"/>
+      <w:pPr>
+        <w:tabs>
+          <w:tab w:val="num" w:pos="2880"/>
+        </w:tabs>
+        <w:ind w:left="2880" w:hanging="360"/>
+      </w:pPr>
+      <w:rPr>
+        <w:rFonts w:ascii="Wingdings" w:hAnsi="Wingdings" w:hint="default"/>
+        <w:sz w:val="20"/>
+      </w:rPr>
+    </w:lvl>
+    <w:lvl w:ilvl="4" w:tentative="1">
+      <w:start w:val="1"/>
+      <w:numFmt w:val="bullet"/>
+      <w:lvlText w:val=""/>
+      <w:lvlJc w:val="left"/>
+      <w:pPr>
+        <w:tabs>
+          <w:tab w:val="num" w:pos="3600"/>
+        </w:tabs>
+        <w:ind w:left="3600" w:hanging="360"/>
+      </w:pPr>
+      <w:rPr>
+        <w:rFonts w:ascii="Wingdings" w:hAnsi="Wingdings" w:hint="default"/>
+        <w:sz w:val="20"/>
+      </w:rPr>
+    </w:lvl>
+    <w:lvl w:ilvl="5" w:tentative="1">
+      <w:start w:val="1"/>
+      <w:numFmt w:val="bullet"/>
+      <w:lvlText w:val=""/>
+      <w:lvlJc w:val="left"/>
+      <w:pPr>
+        <w:tabs>
+          <w:tab w:val="num" w:pos="4320"/>
+        </w:tabs>
+        <w:ind w:left="4320" w:hanging="360"/>
+      </w:pPr>
+      <w:rPr>
+        <w:rFonts w:ascii="Wingdings" w:hAnsi="Wingdings" w:hint="default"/>
+        <w:sz w:val="20"/>
+      </w:rPr>
+    </w:lvl>
+    <w:lvl w:ilvl="6" w:tentative="1">
+      <w:start w:val="1"/>
+      <w:numFmt w:val="bullet"/>
+      <w:lvlText w:val=""/>
+      <w:lvlJc w:val="left"/>
+      <w:pPr>
+        <w:tabs>
+          <w:tab w:val="num" w:pos="5040"/>
+        </w:tabs>
+        <w:ind w:left="5040" w:hanging="360"/>
+      </w:pPr>
+      <w:rPr>
+        <w:rFonts w:ascii="Wingdings" w:hAnsi="Wingdings" w:hint="default"/>
+        <w:sz w:val="20"/>
+      </w:rPr>
+    </w:lvl>
+    <w:lvl w:ilvl="7" w:tentative="1">
+      <w:start w:val="1"/>
+      <w:numFmt w:val="bullet"/>
+      <w:lvlText w:val=""/>
+      <w:lvlJc w:val="left"/>
+      <w:pPr>
+        <w:tabs>
+          <w:tab w:val="num" w:pos="5760"/>
+        </w:tabs>
+        <w:ind w:left="5760" w:hanging="360"/>
+      </w:pPr>
+      <w:rPr>
+        <w:rFonts w:ascii="Wingdings" w:hAnsi="Wingdings" w:hint="default"/>
+        <w:sz w:val="20"/>
+      </w:rPr>
+    </w:lvl>
+    <w:lvl w:ilvl="8" w:tentative="1">
+      <w:start w:val="1"/>
+      <w:numFmt w:val="bullet"/>
+      <w:lvlText w:val=""/>
+      <w:lvlJc w:val="left"/>
+      <w:pPr>
+        <w:tabs>
+          <w:tab w:val="num" w:pos="6480"/>
+        </w:tabs>
+        <w:ind w:left="6480" w:hanging="360"/>
+      </w:pPr>
+      <w:rPr>
+        <w:rFonts w:ascii="Wingdings" w:hAnsi="Wingdings" w:hint="default"/>
+        <w:sz w:val="20"/>
       </w:rPr>
     </w:lvl>
   </w:abstractNum>
@@ -1998,10 +5276,10 @@
     <w:abstractNumId w:val="9"/>
   </w:num>
   <w:num w:numId="2" w16cid:durableId="1773436715">
-    <w:abstractNumId w:val="17"/>
+    <w:abstractNumId w:val="25"/>
   </w:num>
   <w:num w:numId="3" w16cid:durableId="394398141">
-    <w:abstractNumId w:val="17"/>
+    <w:abstractNumId w:val="25"/>
     <w:lvlOverride w:ilvl="0">
       <w:startOverride w:val="1"/>
     </w:lvlOverride>
@@ -2037,7 +5315,7 @@
     <w:abstractNumId w:val="0"/>
   </w:num>
   <w:num w:numId="14" w16cid:durableId="887882634">
-    <w:abstractNumId w:val="17"/>
+    <w:abstractNumId w:val="25"/>
     <w:lvlOverride w:ilvl="0">
       <w:startOverride w:val="1"/>
     </w:lvlOverride>
@@ -2067,25 +5345,52 @@
     </w:lvlOverride>
   </w:num>
   <w:num w:numId="15" w16cid:durableId="61148622">
-    <w:abstractNumId w:val="15"/>
+    <w:abstractNumId w:val="20"/>
   </w:num>
   <w:num w:numId="16" w16cid:durableId="960648868">
-    <w:abstractNumId w:val="12"/>
+    <w:abstractNumId w:val="13"/>
   </w:num>
   <w:num w:numId="17" w16cid:durableId="1685280870">
-    <w:abstractNumId w:val="14"/>
+    <w:abstractNumId w:val="19"/>
   </w:num>
   <w:num w:numId="18" w16cid:durableId="1822190852">
     <w:abstractNumId w:val="10"/>
   </w:num>
   <w:num w:numId="19" w16cid:durableId="1942184842">
+    <w:abstractNumId w:val="26"/>
+  </w:num>
+  <w:num w:numId="20" w16cid:durableId="1181163413">
+    <w:abstractNumId w:val="21"/>
+  </w:num>
+  <w:num w:numId="21" w16cid:durableId="2057508361">
+    <w:abstractNumId w:val="15"/>
+  </w:num>
+  <w:num w:numId="22" w16cid:durableId="1528759563">
+    <w:abstractNumId w:val="17"/>
+  </w:num>
+  <w:num w:numId="23" w16cid:durableId="1976133550">
+    <w:abstractNumId w:val="24"/>
+  </w:num>
+  <w:num w:numId="24" w16cid:durableId="1462579046">
+    <w:abstractNumId w:val="14"/>
+  </w:num>
+  <w:num w:numId="25" w16cid:durableId="940914418">
+    <w:abstractNumId w:val="22"/>
+  </w:num>
+  <w:num w:numId="26" w16cid:durableId="1060056989">
+    <w:abstractNumId w:val="16"/>
+  </w:num>
+  <w:num w:numId="27" w16cid:durableId="697198747">
     <w:abstractNumId w:val="18"/>
   </w:num>
-  <w:num w:numId="20" w16cid:durableId="1181163413">
-    <w:abstractNumId w:val="16"/>
+  <w:num w:numId="28" w16cid:durableId="1195651822">
+    <w:abstractNumId w:val="23"/>
   </w:num>
-  <w:num w:numId="21" w16cid:durableId="2057508361">
-    <w:abstractNumId w:val="13"/>
+  <w:num w:numId="29" w16cid:durableId="2062750589">
+    <w:abstractNumId w:val="12"/>
+  </w:num>
+  <w:num w:numId="30" w16cid:durableId="754982848">
+    <w:abstractNumId w:val="27"/>
   </w:num>
 </w:numbering>
 </file>
@@ -3398,6 +6703,30 @@
       <w:contextualSpacing/>
     </w:pPr>
   </w:style>
+  <w:style w:type="character" w:styleId="Strong">
+    <w:name w:val="Strong"/>
+    <w:basedOn w:val="DefaultParagraphFont"/>
+    <w:uiPriority w:val="22"/>
+    <w:qFormat/>
+    <w:rsid w:val="00C934A5"/>
+    <w:rPr>
+      <w:b/>
+      <w:bCs/>
+    </w:rPr>
+  </w:style>
+  <w:style w:type="character" w:styleId="HTMLCode">
+    <w:name w:val="HTML Code"/>
+    <w:basedOn w:val="DefaultParagraphFont"/>
+    <w:uiPriority w:val="99"/>
+    <w:semiHidden/>
+    <w:unhideWhenUsed/>
+    <w:rsid w:val="00C934A5"/>
+    <w:rPr>
+      <w:rFonts w:ascii="Courier New" w:eastAsia="Times New Roman" w:hAnsi="Courier New" w:cs="Courier New"/>
+      <w:sz w:val="20"/>
+      <w:szCs w:val="20"/>
+    </w:rPr>
+  </w:style>
 </w:styles>
 </file>
 

</xml_diff>